<commit_message>
vault backup: 2026-05-08 18:08:13
</commit_message>
<xml_diff>
--- a/学校事务/编译原理/文档编写/编译原理实验报告_语义与中间代码生成.docx
+++ b/学校事务/编译原理/文档编写/编译原理实验报告_语义与中间代码生成.docx
@@ -18,12 +18,13 @@
     </w:p>
     <w:p>
       <w:pPr>
-        <w:spacing w:after="1600"/>
+        <w:spacing w:before="0" w:after="1600"/>
         <w:jc w:val="center"/>
       </w:pPr>
       <w:r>
         <w:rPr>
           <w:rFonts w:ascii="宋体" w:hAnsi="宋体" w:eastAsia="宋体"/>
+          <w:b w:val="0"/>
           <w:sz w:val="32"/>
         </w:rPr>
         <w:t>语义分析与中间代码生成</w:t>
@@ -31,11 +32,13 @@
     </w:p>
     <w:p>
       <w:pPr>
+        <w:spacing w:before="0" w:after="160"/>
         <w:jc w:val="center"/>
       </w:pPr>
       <w:r>
         <w:rPr>
           <w:rFonts w:ascii="宋体" w:hAnsi="宋体" w:eastAsia="宋体"/>
+          <w:b w:val="0"/>
           <w:sz w:val="24"/>
         </w:rPr>
         <w:t>学号：12303070250    姓名：黄彬    时间：2026年5月</w:t>
@@ -48,7 +51,7 @@
     </w:p>
     <w:p>
       <w:pPr>
-        <w:spacing w:before="0" w:after="360"/>
+        <w:spacing w:before="0" w:after="240"/>
         <w:jc w:val="center"/>
       </w:pPr>
       <w:r>
@@ -63,20 +66,7 @@
     </w:p>
     <w:p>
       <w:pPr>
-        <w:spacing w:after="360"/>
-        <w:jc w:val="center"/>
-      </w:pPr>
-      <w:r>
-        <w:rPr>
-          <w:rFonts w:ascii="宋体" w:hAnsi="宋体" w:eastAsia="宋体"/>
-          <w:color w:val="1F4E79"/>
-        </w:rPr>
-        <w:t>————————————————————</w:t>
-      </w:r>
-    </w:p>
-    <w:p>
-      <w:pPr>
-        <w:spacing w:after="200" w:line="300" w:lineRule="exact" w:before="160"/>
+        <w:spacing w:before="0" w:after="160"/>
         <w:jc w:val="center"/>
       </w:pPr>
       <w:r>
@@ -90,22 +80,13 @@
     </w:p>
     <w:p>
       <w:pPr>
-        <w:spacing w:after="40" w:line="80" w:lineRule="exact"/>
-      </w:pPr>
-    </w:p>
-    <w:p>
-      <w:pPr>
-        <w:spacing w:after="40" w:line="80" w:lineRule="exact"/>
-      </w:pPr>
-    </w:p>
-    <w:p>
-      <w:pPr>
-        <w:spacing w:after="240" w:line="300" w:lineRule="exact"/>
+        <w:spacing w:before="0" w:after="240"/>
         <w:jc w:val="center"/>
       </w:pPr>
       <w:r>
         <w:rPr>
           <w:rFonts w:ascii="宋体" w:hAnsi="宋体" w:eastAsia="宋体"/>
+          <w:b w:val="0"/>
           <w:sz w:val="21"/>
         </w:rPr>
         <w:t>学号：12303070250    姓名：黄彬    时间：2026年5月</w:t>
@@ -113,17 +94,7 @@
     </w:p>
     <w:p>
       <w:pPr>
-        <w:spacing w:after="40" w:line="80" w:lineRule="exact"/>
-      </w:pPr>
-    </w:p>
-    <w:p>
-      <w:pPr>
-        <w:spacing w:after="40" w:line="80" w:lineRule="exact"/>
-      </w:pPr>
-    </w:p>
-    <w:p>
-      <w:pPr>
-        <w:spacing w:after="120" w:line="300" w:lineRule="exact" w:before="160"/>
+        <w:spacing w:before="160" w:after="100"/>
       </w:pPr>
       <w:r>
         <w:rPr>
@@ -136,56 +107,21 @@
     </w:p>
     <w:p>
       <w:pPr>
-        <w:spacing w:after="40" w:line="80" w:lineRule="exact"/>
-      </w:pPr>
-    </w:p>
-    <w:p>
-      <w:pPr>
-        <w:spacing w:after="60" w:line="300" w:lineRule="exact"/>
+        <w:spacing w:line="300" w:lineRule="exact" w:after="60"/>
         <w:ind w:firstLine="420"/>
       </w:pPr>
       <w:r>
         <w:rPr>
           <w:rFonts w:ascii="宋体" w:hAnsi="宋体" w:eastAsia="宋体"/>
+          <w:b w:val="0"/>
           <w:sz w:val="21"/>
         </w:rPr>
-        <w:t>深入探究编译器语义分析阶段的核心任务，掌握符号表在多层嵌套作用域下的动态构建与维</w:t>
+        <w:t>深入探究编译器语义分析阶段的核心任务，掌握符号表在多层嵌套作用域下的动态构建与维护。研究抽象语法树（AST）的深度优先遍历算法，并将其应用于类型检查、控制流合法性验证等语义约束任务。</w:t>
       </w:r>
     </w:p>
     <w:p>
       <w:pPr>
-        <w:spacing w:after="60" w:line="300" w:lineRule="exact"/>
-        <w:ind w:firstLine="420"/>
-      </w:pPr>
-      <w:r>
-        <w:rPr>
-          <w:rFonts w:ascii="宋体" w:hAnsi="宋体" w:eastAsia="宋体"/>
-          <w:sz w:val="21"/>
-        </w:rPr>
-        <w:t>护。研究抽象语法树（AST）的深度优先遍历算法，并将其应用于类型检查、控制流合法性验证</w:t>
-      </w:r>
-    </w:p>
-    <w:p>
-      <w:pPr>
-        <w:spacing w:after="60" w:line="300" w:lineRule="exact"/>
-        <w:ind w:firstLine="420"/>
-      </w:pPr>
-      <w:r>
-        <w:rPr>
-          <w:rFonts w:ascii="宋体" w:hAnsi="宋体" w:eastAsia="宋体"/>
-          <w:sz w:val="21"/>
-        </w:rPr>
-        <w:t>等语义约束任务。</w:t>
-      </w:r>
-    </w:p>
-    <w:p>
-      <w:pPr>
-        <w:spacing w:after="40" w:line="80" w:lineRule="exact"/>
-      </w:pPr>
-    </w:p>
-    <w:p>
-      <w:pPr>
-        <w:spacing w:after="120" w:line="300" w:lineRule="exact" w:before="160"/>
+        <w:spacing w:before="160" w:after="100"/>
       </w:pPr>
       <w:r>
         <w:rPr>
@@ -198,43 +134,21 @@
     </w:p>
     <w:p>
       <w:pPr>
-        <w:spacing w:after="40" w:line="80" w:lineRule="exact"/>
-      </w:pPr>
-    </w:p>
-    <w:p>
-      <w:pPr>
-        <w:spacing w:after="60" w:line="300" w:lineRule="exact"/>
+        <w:spacing w:line="300" w:lineRule="exact" w:after="60"/>
         <w:ind w:firstLine="420"/>
       </w:pPr>
       <w:r>
         <w:rPr>
           <w:rFonts w:ascii="宋体" w:hAnsi="宋体" w:eastAsia="宋体"/>
+          <w:b w:val="0"/>
           <w:sz w:val="21"/>
         </w:rPr>
-        <w:t>构建能够处理复杂 AST 结构的语义分析器，实现树结构重建、多维符号表管理以及包括名字</w:t>
+        <w:t>构建能够处理复杂 AST 结构的语义分析器，实现树结构重建、多维符号表管理以及包括名字重复、未声明使用、函数参数匹配、跳转指令合法性等十类语义异常的精准校验。</w:t>
       </w:r>
     </w:p>
     <w:p>
       <w:pPr>
-        <w:spacing w:after="60" w:line="300" w:lineRule="exact"/>
-        <w:ind w:firstLine="420"/>
-      </w:pPr>
-      <w:r>
-        <w:rPr>
-          <w:rFonts w:ascii="宋体" w:hAnsi="宋体" w:eastAsia="宋体"/>
-          <w:sz w:val="21"/>
-        </w:rPr>
-        <w:t>重复、未声明使用、函数参数匹配、跳转指令合法性等十类语义异常的精准校验。</w:t>
-      </w:r>
-    </w:p>
-    <w:p>
-      <w:pPr>
-        <w:spacing w:after="40" w:line="80" w:lineRule="exact"/>
-      </w:pPr>
-    </w:p>
-    <w:p>
-      <w:pPr>
-        <w:spacing w:after="120" w:line="300" w:lineRule="exact" w:before="160"/>
+        <w:spacing w:before="160" w:after="100"/>
       </w:pPr>
       <w:r>
         <w:rPr>
@@ -247,12 +161,7 @@
     </w:p>
     <w:p>
       <w:pPr>
-        <w:spacing w:after="40" w:line="80" w:lineRule="exact"/>
-      </w:pPr>
-    </w:p>
-    <w:p>
-      <w:pPr>
-        <w:spacing w:after="80" w:line="300" w:lineRule="exact" w:before="100"/>
+        <w:spacing w:before="100" w:after="100"/>
       </w:pPr>
       <w:r>
         <w:rPr>
@@ -265,56 +174,21 @@
     </w:p>
     <w:p>
       <w:pPr>
-        <w:spacing w:after="40" w:line="80" w:lineRule="exact"/>
-      </w:pPr>
-    </w:p>
-    <w:p>
-      <w:pPr>
-        <w:spacing w:after="60" w:line="300" w:lineRule="exact"/>
+        <w:spacing w:line="300" w:lineRule="exact" w:after="60"/>
         <w:ind w:firstLine="420"/>
       </w:pPr>
       <w:r>
         <w:rPr>
           <w:rFonts w:ascii="宋体" w:hAnsi="宋体" w:eastAsia="宋体"/>
+          <w:b w:val="0"/>
           <w:sz w:val="21"/>
         </w:rPr>
-        <w:t>采用“抽象语法树递归遍历与上下文状态传参”方案。符号表利用 list[dict] 栈维护，实</w:t>
+        <w:t>采用“抽象语法树递归遍历与上下文状态传参”方案。符号表利用 list[dict] 栈维护，实现作用域动态覆盖。针对 break 判定，引入递归传参机制，确保控制流在复杂嵌套下的判定鲁棒性。针对返回语句缺失，设计了基于子树最大行号的回溯定位逻辑。</w:t>
       </w:r>
     </w:p>
     <w:p>
       <w:pPr>
-        <w:spacing w:after="60" w:line="300" w:lineRule="exact"/>
-        <w:ind w:firstLine="420"/>
-      </w:pPr>
-      <w:r>
-        <w:rPr>
-          <w:rFonts w:ascii="宋体" w:hAnsi="宋体" w:eastAsia="宋体"/>
-          <w:sz w:val="21"/>
-        </w:rPr>
-        <w:t>现作用域动态覆盖。针对 break 判定，引入递归传参机制，确保控制流在复杂嵌套下的判定鲁棒</w:t>
-      </w:r>
-    </w:p>
-    <w:p>
-      <w:pPr>
-        <w:spacing w:after="60" w:line="300" w:lineRule="exact"/>
-        <w:ind w:firstLine="420"/>
-      </w:pPr>
-      <w:r>
-        <w:rPr>
-          <w:rFonts w:ascii="宋体" w:hAnsi="宋体" w:eastAsia="宋体"/>
-          <w:sz w:val="21"/>
-        </w:rPr>
-        <w:t>性。针对返回语句缺失，设计了基于子树最大行号的回溯定位逻辑。</w:t>
-      </w:r>
-    </w:p>
-    <w:p>
-      <w:pPr>
-        <w:spacing w:after="40" w:line="80" w:lineRule="exact"/>
-      </w:pPr>
-    </w:p>
-    <w:p>
-      <w:pPr>
-        <w:spacing w:after="80" w:line="300" w:lineRule="exact" w:before="100"/>
+        <w:spacing w:before="100" w:after="100"/>
       </w:pPr>
       <w:r>
         <w:rPr>
@@ -327,43 +201,21 @@
     </w:p>
     <w:p>
       <w:pPr>
-        <w:spacing w:after="40" w:line="80" w:lineRule="exact"/>
-      </w:pPr>
-    </w:p>
-    <w:p>
-      <w:pPr>
-        <w:spacing w:after="60" w:line="300" w:lineRule="exact"/>
+        <w:spacing w:line="300" w:lineRule="exact" w:after="60"/>
         <w:ind w:firstLine="420"/>
       </w:pPr>
       <w:r>
         <w:rPr>
           <w:rFonts w:ascii="宋体" w:hAnsi="宋体" w:eastAsia="宋体"/>
+          <w:b w:val="0"/>
           <w:sz w:val="21"/>
         </w:rPr>
-        <w:t>方案优势在于通过递归传参而非全局变量，解决了多层嵌套下的状态丢失问题。字典栈机制</w:t>
+        <w:t>方案优势在于通过递归传参而非全局变量，解决了多层嵌套下的状态丢失问题。字典栈机制保证了空间效率，使分析器在处理深度嵌套时依然能维持稳定的性能表现。</w:t>
       </w:r>
     </w:p>
     <w:p>
       <w:pPr>
-        <w:spacing w:after="60" w:line="300" w:lineRule="exact"/>
-        <w:ind w:firstLine="420"/>
-      </w:pPr>
-      <w:r>
-        <w:rPr>
-          <w:rFonts w:ascii="宋体" w:hAnsi="宋体" w:eastAsia="宋体"/>
-          <w:sz w:val="21"/>
-        </w:rPr>
-        <w:t>保证了空间效率，使分析器在处理深度嵌套时依然能维持稳定的性能表现。</w:t>
-      </w:r>
-    </w:p>
-    <w:p>
-      <w:pPr>
-        <w:spacing w:after="40" w:line="80" w:lineRule="exact"/>
-      </w:pPr>
-    </w:p>
-    <w:p>
-      <w:pPr>
-        <w:spacing w:after="120" w:line="300" w:lineRule="exact" w:before="160"/>
+        <w:spacing w:before="160" w:after="100"/>
       </w:pPr>
       <w:r>
         <w:rPr>
@@ -376,144 +228,303 @@
     </w:p>
     <w:p>
       <w:pPr>
-        <w:spacing w:after="40" w:line="80" w:lineRule="exact"/>
-      </w:pPr>
-    </w:p>
-    <w:p>
-      <w:pPr>
-        <w:spacing w:after="60" w:line="300" w:lineRule="exact"/>
+        <w:spacing w:line="300" w:lineRule="exact" w:after="60"/>
         <w:ind w:firstLine="420"/>
       </w:pPr>
       <w:r>
         <w:rPr>
           <w:rFonts w:ascii="宋体" w:hAnsi="宋体" w:eastAsia="宋体"/>
+          <w:b w:val="0"/>
           <w:sz w:val="21"/>
         </w:rPr>
         <w:t>通过对典型逻辑场景的推演，验证了分析器对各种边界情况的覆盖能力。</w:t>
       </w:r>
     </w:p>
+    <w:tbl>
+      <w:tblPr>
+        <w:tblStyle w:val="TableGrid"/>
+        <w:tblW w:type="auto" w:w="0"/>
+        <w:jc w:val="center"/>
+        <w:tblLayout w:type="fixed"/>
+        <w:tblLook w:firstColumn="1" w:firstRow="1" w:lastColumn="0" w:lastRow="0" w:noHBand="0" w:noVBand="1" w:val="04A0"/>
+      </w:tblPr>
+      <w:tblGrid>
+        <w:gridCol w:w="3081"/>
+        <w:gridCol w:w="3081"/>
+        <w:gridCol w:w="3081"/>
+      </w:tblGrid>
+      <w:tr>
+        <w:tc>
+          <w:tcPr>
+            <w:tcW w:type="dxa" w:w="1474"/>
+            <w:shd w:fill="D9EAF7"/>
+            <w:vAlign w:val="center"/>
+          </w:tcPr>
+          <w:p>
+            <w:pPr>
+              <w:spacing w:after="0" w:line="240" w:lineRule="exact"/>
+              <w:jc w:val="center"/>
+            </w:pPr>
+            <w:r/>
+            <w:r>
+              <w:rPr>
+                <w:rFonts w:ascii="宋体" w:hAnsi="宋体" w:eastAsia="宋体"/>
+                <w:b/>
+                <w:sz w:val="18"/>
+              </w:rPr>
+              <w:t>测试场景</w:t>
+            </w:r>
+          </w:p>
+        </w:tc>
+        <w:tc>
+          <w:tcPr>
+            <w:tcW w:type="dxa" w:w="4932"/>
+            <w:shd w:fill="D9EAF7"/>
+            <w:vAlign w:val="center"/>
+          </w:tcPr>
+          <w:p>
+            <w:pPr>
+              <w:spacing w:after="0" w:line="240" w:lineRule="exact"/>
+              <w:jc w:val="center"/>
+            </w:pPr>
+            <w:r/>
+            <w:r>
+              <w:rPr>
+                <w:rFonts w:ascii="宋体" w:hAnsi="宋体" w:eastAsia="宋体"/>
+                <w:b/>
+                <w:sz w:val="18"/>
+              </w:rPr>
+              <w:t>逻辑推演与设计考量</w:t>
+            </w:r>
+          </w:p>
+        </w:tc>
+        <w:tc>
+          <w:tcPr>
+            <w:tcW w:type="dxa" w:w="2608"/>
+            <w:shd w:fill="D9EAF7"/>
+            <w:vAlign w:val="center"/>
+          </w:tcPr>
+          <w:p>
+            <w:pPr>
+              <w:spacing w:after="0" w:line="240" w:lineRule="exact"/>
+              <w:jc w:val="center"/>
+            </w:pPr>
+            <w:r/>
+            <w:r>
+              <w:rPr>
+                <w:rFonts w:ascii="宋体" w:hAnsi="宋体" w:eastAsia="宋体"/>
+                <w:b/>
+                <w:sz w:val="18"/>
+              </w:rPr>
+              <w:t>验证结果</w:t>
+            </w:r>
+          </w:p>
+        </w:tc>
+      </w:tr>
+      <w:tr>
+        <w:tc>
+          <w:tcPr>
+            <w:tcW w:type="dxa" w:w="1474"/>
+            <w:vAlign w:val="center"/>
+          </w:tcPr>
+          <w:p>
+            <w:pPr>
+              <w:spacing w:after="0" w:line="240" w:lineRule="exact"/>
+              <w:jc w:val="center"/>
+            </w:pPr>
+            <w:r/>
+            <w:r>
+              <w:rPr>
+                <w:rFonts w:ascii="宋体" w:hAnsi="宋体" w:eastAsia="宋体"/>
+                <w:b w:val="0"/>
+                <w:sz w:val="17"/>
+              </w:rPr>
+              <w:t>作用域覆盖</w:t>
+            </w:r>
+          </w:p>
+        </w:tc>
+        <w:tc>
+          <w:tcPr>
+            <w:tcW w:type="dxa" w:w="4932"/>
+            <w:vAlign w:val="center"/>
+          </w:tcPr>
+          <w:p>
+            <w:pPr>
+              <w:spacing w:after="0" w:line="240" w:lineRule="exact"/>
+              <w:jc w:val="left"/>
+            </w:pPr>
+            <w:r/>
+            <w:r>
+              <w:rPr>
+                <w:rFonts w:ascii="宋体" w:hAnsi="宋体" w:eastAsia="宋体"/>
+                <w:b w:val="0"/>
+                <w:sz w:val="17"/>
+              </w:rPr>
+              <w:t>模拟多层嵌套定义。推论要求内层引用屏蔽外层定义，且同级检测冲突。</w:t>
+            </w:r>
+          </w:p>
+        </w:tc>
+        <w:tc>
+          <w:tcPr>
+            <w:tcW w:type="dxa" w:w="2608"/>
+            <w:vAlign w:val="center"/>
+          </w:tcPr>
+          <w:p>
+            <w:pPr>
+              <w:spacing w:after="0" w:line="240" w:lineRule="exact"/>
+              <w:jc w:val="center"/>
+            </w:pPr>
+            <w:r/>
+            <w:r>
+              <w:rPr>
+                <w:rFonts w:ascii="宋体" w:hAnsi="宋体" w:eastAsia="宋体"/>
+                <w:b w:val="0"/>
+                <w:sz w:val="17"/>
+              </w:rPr>
+              <w:t>逻辑契合。精准识别 301 与 302 异常。</w:t>
+            </w:r>
+          </w:p>
+        </w:tc>
+      </w:tr>
+      <w:tr>
+        <w:tc>
+          <w:tcPr>
+            <w:tcW w:type="dxa" w:w="1474"/>
+            <w:vAlign w:val="center"/>
+          </w:tcPr>
+          <w:p>
+            <w:pPr>
+              <w:spacing w:after="0" w:line="240" w:lineRule="exact"/>
+              <w:jc w:val="center"/>
+            </w:pPr>
+            <w:r/>
+            <w:r>
+              <w:rPr>
+                <w:rFonts w:ascii="宋体" w:hAnsi="宋体" w:eastAsia="宋体"/>
+                <w:b w:val="0"/>
+                <w:sz w:val="17"/>
+              </w:rPr>
+              <w:t>跳转指令合法性</w:t>
+            </w:r>
+          </w:p>
+        </w:tc>
+        <w:tc>
+          <w:tcPr>
+            <w:tcW w:type="dxa" w:w="4932"/>
+            <w:vAlign w:val="center"/>
+          </w:tcPr>
+          <w:p>
+            <w:pPr>
+              <w:spacing w:after="0" w:line="240" w:lineRule="exact"/>
+              <w:jc w:val="left"/>
+            </w:pPr>
+            <w:r/>
+            <w:r>
+              <w:rPr>
+                <w:rFonts w:ascii="宋体" w:hAnsi="宋体" w:eastAsia="宋体"/>
+                <w:b w:val="0"/>
+                <w:sz w:val="17"/>
+              </w:rPr>
+              <w:t>考虑到 break 可能隐藏在深层 IfStmt 中。通过上下文路径传递，推测系统需具备全局穿透识别力。</w:t>
+            </w:r>
+          </w:p>
+        </w:tc>
+        <w:tc>
+          <w:tcPr>
+            <w:tcW w:type="dxa" w:w="2608"/>
+            <w:vAlign w:val="center"/>
+          </w:tcPr>
+          <w:p>
+            <w:pPr>
+              <w:spacing w:after="0" w:line="240" w:lineRule="exact"/>
+              <w:jc w:val="center"/>
+            </w:pPr>
+            <w:r/>
+            <w:r>
+              <w:rPr>
+                <w:rFonts w:ascii="宋体" w:hAnsi="宋体" w:eastAsia="宋体"/>
+                <w:b w:val="0"/>
+                <w:sz w:val="17"/>
+              </w:rPr>
+              <w:t>逻辑契合。成功识别各类跳转作用域，无误报。</w:t>
+            </w:r>
+          </w:p>
+        </w:tc>
+      </w:tr>
+      <w:tr>
+        <w:tc>
+          <w:tcPr>
+            <w:tcW w:type="dxa" w:w="1474"/>
+            <w:vAlign w:val="center"/>
+          </w:tcPr>
+          <w:p>
+            <w:pPr>
+              <w:spacing w:after="0" w:line="240" w:lineRule="exact"/>
+              <w:jc w:val="center"/>
+            </w:pPr>
+            <w:r/>
+            <w:r>
+              <w:rPr>
+                <w:rFonts w:ascii="宋体" w:hAnsi="宋体" w:eastAsia="宋体"/>
+                <w:b w:val="0"/>
+                <w:sz w:val="17"/>
+              </w:rPr>
+              <w:t>延迟判定定位</w:t>
+            </w:r>
+          </w:p>
+        </w:tc>
+        <w:tc>
+          <w:tcPr>
+            <w:tcW w:type="dxa" w:w="4932"/>
+            <w:vAlign w:val="center"/>
+          </w:tcPr>
+          <w:p>
+            <w:pPr>
+              <w:spacing w:after="0" w:line="240" w:lineRule="exact"/>
+              <w:jc w:val="left"/>
+            </w:pPr>
+            <w:r/>
+            <w:r>
+              <w:rPr>
+                <w:rFonts w:ascii="宋体" w:hAnsi="宋体" w:eastAsia="宋体"/>
+                <w:b w:val="0"/>
+                <w:sz w:val="17"/>
+              </w:rPr>
+              <w:t>针对 Return 缺失，推测报错需在逻辑终点。设计了行号回溯推演。</w:t>
+            </w:r>
+          </w:p>
+        </w:tc>
+        <w:tc>
+          <w:tcPr>
+            <w:tcW w:type="dxa" w:w="2608"/>
+            <w:vAlign w:val="center"/>
+          </w:tcPr>
+          <w:p>
+            <w:pPr>
+              <w:spacing w:after="0" w:line="240" w:lineRule="exact"/>
+              <w:jc w:val="center"/>
+            </w:pPr>
+            <w:r/>
+            <w:r>
+              <w:rPr>
+                <w:rFonts w:ascii="宋体" w:hAnsi="宋体" w:eastAsia="宋体"/>
+                <w:b w:val="0"/>
+                <w:sz w:val="17"/>
+              </w:rPr>
+              <w:t>逻辑契合。在函数终点准确报告 307。</w:t>
+            </w:r>
+          </w:p>
+        </w:tc>
+      </w:tr>
+    </w:tbl>
     <w:p>
       <w:pPr>
-        <w:spacing w:after="40" w:line="80" w:lineRule="exact"/>
+        <w:spacing w:after="80"/>
       </w:pPr>
     </w:p>
     <w:p>
       <w:pPr>
-        <w:spacing w:after="40" w:line="80" w:lineRule="exact"/>
-      </w:pPr>
-    </w:p>
-    <w:p>
-      <w:pPr>
-        <w:spacing w:after="20" w:line="240" w:lineRule="exact"/>
-      </w:pPr>
-      <w:r>
-        <w:rPr>
-          <w:rFonts w:ascii="Consolas" w:hAnsi="Consolas" w:eastAsia="宋体"/>
-          <w:sz w:val="16"/>
-        </w:rPr>
-        <w:t xml:space="preserve"> 测试场景                             逻辑推演与设计考量                                          验证结果</w:t>
-      </w:r>
-    </w:p>
-    <w:p>
-      <w:pPr>
-        <w:spacing w:after="40" w:line="80" w:lineRule="exact"/>
-      </w:pPr>
-    </w:p>
-    <w:p>
-      <w:pPr>
-        <w:spacing w:after="20" w:line="240" w:lineRule="exact"/>
-      </w:pPr>
-      <w:r>
-        <w:rPr>
-          <w:rFonts w:ascii="Consolas" w:hAnsi="Consolas" w:eastAsia="宋体"/>
-          <w:sz w:val="16"/>
-        </w:rPr>
-        <w:t>作用域覆    模拟多层嵌套定义。推论要求内层引用屏蔽外层定义，且          逻辑契合。精准识别 301 与</w:t>
-      </w:r>
-    </w:p>
-    <w:p>
-      <w:pPr>
-        <w:spacing w:after="20" w:line="240" w:lineRule="exact"/>
-      </w:pPr>
-      <w:r>
-        <w:rPr>
-          <w:rFonts w:ascii="Consolas" w:hAnsi="Consolas" w:eastAsia="宋体"/>
-          <w:sz w:val="16"/>
-        </w:rPr>
-        <w:t>盖       同级检测冲突。                            302 异常。</w:t>
-      </w:r>
-    </w:p>
-    <w:p>
-      <w:pPr>
-        <w:spacing w:after="40" w:line="80" w:lineRule="exact"/>
-      </w:pPr>
-    </w:p>
-    <w:p>
-      <w:pPr>
-        <w:spacing w:after="20" w:line="240" w:lineRule="exact"/>
-      </w:pPr>
-      <w:r>
-        <w:rPr>
-          <w:rFonts w:ascii="Consolas" w:hAnsi="Consolas" w:eastAsia="宋体"/>
-          <w:sz w:val="16"/>
-        </w:rPr>
-        <w:t>跳转指令    考虑到 break 可能隐藏在深层 IfStmt 中。通过上下文路径 逻辑契合。成功识别各类跳</w:t>
-      </w:r>
-    </w:p>
-    <w:p>
-      <w:pPr>
-        <w:spacing w:after="20" w:line="240" w:lineRule="exact"/>
-      </w:pPr>
-      <w:r>
-        <w:rPr>
-          <w:rFonts w:ascii="Consolas" w:hAnsi="Consolas" w:eastAsia="宋体"/>
-          <w:sz w:val="16"/>
-        </w:rPr>
-        <w:t>合法性     传递，推测系统需具备全局穿透识别力。                 转作用域，无误报。</w:t>
-      </w:r>
-    </w:p>
-    <w:p>
-      <w:r>
-        <w:br w:type="page"/>
-      </w:r>
-    </w:p>
-    <w:p>
-      <w:pPr>
-        <w:spacing w:after="20" w:line="240" w:lineRule="exact"/>
-      </w:pPr>
-      <w:r>
-        <w:rPr>
-          <w:rFonts w:ascii="Consolas" w:hAnsi="Consolas" w:eastAsia="宋体"/>
-          <w:sz w:val="16"/>
-        </w:rPr>
-        <w:t>延迟判定   针对 Return 缺失，推测报错需在逻辑终点。设计了行号回    逻辑契合。在函数终点准确</w:t>
-      </w:r>
-    </w:p>
-    <w:p>
-      <w:pPr>
-        <w:spacing w:after="20" w:line="240" w:lineRule="exact"/>
-      </w:pPr>
-      <w:r>
-        <w:rPr>
-          <w:rFonts w:ascii="Consolas" w:hAnsi="Consolas" w:eastAsia="宋体"/>
-          <w:sz w:val="16"/>
-        </w:rPr>
-        <w:t>定位     溯推演。                              报告 307。</w:t>
-      </w:r>
-    </w:p>
-    <w:p>
-      <w:pPr>
-        <w:spacing w:after="40" w:line="80" w:lineRule="exact"/>
-      </w:pPr>
-    </w:p>
-    <w:p>
-      <w:pPr>
-        <w:spacing w:after="40" w:line="80" w:lineRule="exact"/>
-      </w:pPr>
-    </w:p>
-    <w:p>
-      <w:pPr>
-        <w:spacing w:after="120" w:line="300" w:lineRule="exact" w:before="160"/>
+        <w:spacing w:before="160" w:after="100"/>
       </w:pPr>
       <w:r>
         <w:rPr>
@@ -526,46 +537,16 @@
     </w:p>
     <w:p>
       <w:pPr>
-        <w:spacing w:after="40" w:line="80" w:lineRule="exact"/>
-      </w:pPr>
-    </w:p>
-    <w:p>
-      <w:pPr>
-        <w:spacing w:after="60" w:line="300" w:lineRule="exact"/>
+        <w:spacing w:line="300" w:lineRule="exact" w:after="60"/>
         <w:ind w:firstLine="420"/>
       </w:pPr>
       <w:r>
         <w:rPr>
           <w:rFonts w:ascii="宋体" w:hAnsi="宋体" w:eastAsia="宋体"/>
+          <w:b w:val="0"/>
           <w:sz w:val="21"/>
         </w:rPr>
-        <w:t>实验证明，语义分析的精确性源于对上下文的深度建模。通过“符号表栈”与“路径状态下</w:t>
-      </w:r>
-    </w:p>
-    <w:p>
-      <w:pPr>
-        <w:spacing w:after="60" w:line="300" w:lineRule="exact"/>
-        <w:ind w:firstLine="420"/>
-      </w:pPr>
-      <w:r>
-        <w:rPr>
-          <w:rFonts w:ascii="宋体" w:hAnsi="宋体" w:eastAsia="宋体"/>
-          <w:sz w:val="21"/>
-        </w:rPr>
-        <w:t>传”技术，系统表现出了极高的确定性，能够严谨地处理 C 风格语言中复杂的控制流与类型约束</w:t>
-      </w:r>
-    </w:p>
-    <w:p>
-      <w:pPr>
-        <w:spacing w:after="60" w:line="300" w:lineRule="exact"/>
-        <w:ind w:firstLine="420"/>
-      </w:pPr>
-      <w:r>
-        <w:rPr>
-          <w:rFonts w:ascii="宋体" w:hAnsi="宋体" w:eastAsia="宋体"/>
-          <w:sz w:val="21"/>
-        </w:rPr>
-        <w:t>任务。</w:t>
+        <w:t>实验证明，语义分析的精确性源于对上下文的深度建模。通过“符号表栈”与“路径状态下传”技术，系统表现出了极高的确定性，能够严谨地处理 C 风格语言中复杂的控制流与类型约束任务。</w:t>
       </w:r>
     </w:p>
     <w:p>
@@ -575,7 +556,7 @@
     </w:p>
     <w:p>
       <w:pPr>
-        <w:spacing w:before="0" w:after="360"/>
+        <w:spacing w:before="0" w:after="240"/>
         <w:jc w:val="center"/>
       </w:pPr>
       <w:r>
@@ -590,20 +571,7 @@
     </w:p>
     <w:p>
       <w:pPr>
-        <w:spacing w:after="360"/>
-        <w:jc w:val="center"/>
-      </w:pPr>
-      <w:r>
-        <w:rPr>
-          <w:rFonts w:ascii="宋体" w:hAnsi="宋体" w:eastAsia="宋体"/>
-          <w:color w:val="1F4E79"/>
-        </w:rPr>
-        <w:t>————————————————————</w:t>
-      </w:r>
-    </w:p>
-    <w:p>
-      <w:pPr>
-        <w:spacing w:after="200" w:line="300" w:lineRule="exact" w:before="160"/>
+        <w:spacing w:before="0" w:after="160"/>
         <w:jc w:val="center"/>
       </w:pPr>
       <w:r>
@@ -617,40 +585,21 @@
     </w:p>
     <w:p>
       <w:pPr>
-        <w:spacing w:after="40" w:line="80" w:lineRule="exact"/>
-      </w:pPr>
-    </w:p>
-    <w:p>
-      <w:pPr>
-        <w:spacing w:after="40" w:line="80" w:lineRule="exact"/>
-      </w:pPr>
-    </w:p>
-    <w:p>
-      <w:pPr>
-        <w:spacing w:after="240" w:line="300" w:lineRule="exact"/>
+        <w:spacing w:before="0" w:after="240"/>
         <w:jc w:val="center"/>
       </w:pPr>
       <w:r>
         <w:rPr>
           <w:rFonts w:ascii="宋体" w:hAnsi="宋体" w:eastAsia="宋体"/>
+          <w:b w:val="0"/>
           <w:sz w:val="21"/>
         </w:rPr>
-        <w:t>学号：    12303070250    姓名：    黄彬    时间：    2026年5月8日</w:t>
+        <w:t>学号：12303070250    姓名：黄彬    时间：2026年5月8日</w:t>
       </w:r>
     </w:p>
     <w:p>
       <w:pPr>
-        <w:spacing w:after="40" w:line="80" w:lineRule="exact"/>
-      </w:pPr>
-    </w:p>
-    <w:p>
-      <w:pPr>
-        <w:spacing w:after="40" w:line="80" w:lineRule="exact"/>
-      </w:pPr>
-    </w:p>
-    <w:p>
-      <w:pPr>
-        <w:spacing w:after="120" w:line="300" w:lineRule="exact" w:before="160"/>
+        <w:spacing w:before="160" w:after="100"/>
       </w:pPr>
       <w:r>
         <w:rPr>
@@ -663,56 +612,21 @@
     </w:p>
     <w:p>
       <w:pPr>
-        <w:spacing w:after="40" w:line="80" w:lineRule="exact"/>
-      </w:pPr>
-    </w:p>
-    <w:p>
-      <w:pPr>
-        <w:spacing w:after="60" w:line="300" w:lineRule="exact"/>
+        <w:spacing w:line="300" w:lineRule="exact" w:after="60"/>
         <w:ind w:firstLine="420"/>
       </w:pPr>
       <w:r>
         <w:rPr>
           <w:rFonts w:ascii="宋体" w:hAnsi="宋体" w:eastAsia="宋体"/>
+          <w:b w:val="0"/>
           <w:sz w:val="21"/>
         </w:rPr>
-        <w:t>深入理解属性文法及语法制导翻译的核心原理；掌握 Sample 语言中各种程序结构（如声</w:t>
+        <w:t>深入理解属性文法及语法制导翻译的核心原理；掌握 Sample 语言中各种程序结构（如声明、赋值、循环、分支及函数调用）到四元式的映射方法；熟练运用拉链回填技术处理非线性控制流。</w:t>
       </w:r>
     </w:p>
     <w:p>
       <w:pPr>
-        <w:spacing w:after="60" w:line="300" w:lineRule="exact"/>
-        <w:ind w:firstLine="420"/>
-      </w:pPr>
-      <w:r>
-        <w:rPr>
-          <w:rFonts w:ascii="宋体" w:hAnsi="宋体" w:eastAsia="宋体"/>
-          <w:sz w:val="21"/>
-        </w:rPr>
-        <w:t>明、赋值、循环、分支及函数调用）到四元式的映射方法；熟练运用拉链回填技术处理非线性控</w:t>
-      </w:r>
-    </w:p>
-    <w:p>
-      <w:pPr>
-        <w:spacing w:after="60" w:line="300" w:lineRule="exact"/>
-        <w:ind w:firstLine="420"/>
-      </w:pPr>
-      <w:r>
-        <w:rPr>
-          <w:rFonts w:ascii="宋体" w:hAnsi="宋体" w:eastAsia="宋体"/>
-          <w:sz w:val="21"/>
-        </w:rPr>
-        <w:t>制流。</w:t>
-      </w:r>
-    </w:p>
-    <w:p>
-      <w:pPr>
-        <w:spacing w:after="40" w:line="80" w:lineRule="exact"/>
-      </w:pPr>
-    </w:p>
-    <w:p>
-      <w:pPr>
-        <w:spacing w:after="120" w:line="300" w:lineRule="exact" w:before="160"/>
+        <w:spacing w:before="160" w:after="100"/>
       </w:pPr>
       <w:r>
         <w:rPr>
@@ -725,56 +639,21 @@
     </w:p>
     <w:p>
       <w:pPr>
-        <w:spacing w:after="40" w:line="80" w:lineRule="exact"/>
-      </w:pPr>
-    </w:p>
-    <w:p>
-      <w:pPr>
-        <w:spacing w:after="60" w:line="300" w:lineRule="exact"/>
+        <w:spacing w:line="300" w:lineRule="exact" w:after="60"/>
         <w:ind w:firstLine="420"/>
       </w:pPr>
       <w:r>
         <w:rPr>
           <w:rFonts w:ascii="宋体" w:hAnsi="宋体" w:eastAsia="宋体"/>
+          <w:b w:val="0"/>
           <w:sz w:val="21"/>
         </w:rPr>
-        <w:t>针对语法、语义无误的源程序，通过对抽象语法树（AST）的递归遍历，生成满足实验要求</w:t>
+        <w:t>针对语法、语义无误的源程序，通过对抽象语法树（AST）的递归遍历，生成满足实验要求的四元式序列。核心目标是实现一套能够处理复杂优先级、布尔短路逻辑、嵌套循环以及跨函数调用参数传递的中间代码生成引擎。</w:t>
       </w:r>
     </w:p>
     <w:p>
       <w:pPr>
-        <w:spacing w:after="60" w:line="300" w:lineRule="exact"/>
-        <w:ind w:firstLine="420"/>
-      </w:pPr>
-      <w:r>
-        <w:rPr>
-          <w:rFonts w:ascii="宋体" w:hAnsi="宋体" w:eastAsia="宋体"/>
-          <w:sz w:val="21"/>
-        </w:rPr>
-        <w:t>的四元式序列。核心目标是实现一套能够处理复杂优先级、布尔短路逻辑、嵌套循环以及跨函数</w:t>
-      </w:r>
-    </w:p>
-    <w:p>
-      <w:pPr>
-        <w:spacing w:after="60" w:line="300" w:lineRule="exact"/>
-        <w:ind w:firstLine="420"/>
-      </w:pPr>
-      <w:r>
-        <w:rPr>
-          <w:rFonts w:ascii="宋体" w:hAnsi="宋体" w:eastAsia="宋体"/>
-          <w:sz w:val="21"/>
-        </w:rPr>
-        <w:t>调用参数传递的中间代码生成引擎。</w:t>
-      </w:r>
-    </w:p>
-    <w:p>
-      <w:pPr>
-        <w:spacing w:after="40" w:line="80" w:lineRule="exact"/>
-      </w:pPr>
-    </w:p>
-    <w:p>
-      <w:pPr>
-        <w:spacing w:after="120" w:line="300" w:lineRule="exact" w:before="160"/>
+        <w:spacing w:before="160" w:after="100"/>
       </w:pPr>
       <w:r>
         <w:rPr>
@@ -787,12 +666,7 @@
     </w:p>
     <w:p>
       <w:pPr>
-        <w:spacing w:after="40" w:line="80" w:lineRule="exact"/>
-      </w:pPr>
-    </w:p>
-    <w:p>
-      <w:pPr>
-        <w:spacing w:after="80" w:line="300" w:lineRule="exact" w:before="100"/>
+        <w:spacing w:before="100" w:after="100"/>
       </w:pPr>
       <w:r>
         <w:rPr>
@@ -805,160 +679,63 @@
     </w:p>
     <w:p>
       <w:pPr>
-        <w:spacing w:after="40" w:line="80" w:lineRule="exact"/>
-      </w:pPr>
-    </w:p>
-    <w:p>
-      <w:pPr>
-        <w:spacing w:after="20" w:line="240" w:lineRule="exact"/>
-      </w:pPr>
-      <w:r>
-        <w:rPr>
-          <w:rFonts w:ascii="Consolas" w:hAnsi="Consolas" w:eastAsia="宋体"/>
-          <w:sz w:val="16"/>
-        </w:rPr>
-        <w:t xml:space="preserve">   为了保证翻译的准确性，本实验采用了基于抽象语法树（AST）的访问者遍历方案                            。具体逻</w:t>
-      </w:r>
-    </w:p>
-    <w:p>
-      <w:pPr>
-        <w:spacing w:after="60" w:line="300" w:lineRule="exact"/>
+        <w:spacing w:line="300" w:lineRule="exact" w:after="60"/>
         <w:ind w:firstLine="420"/>
       </w:pPr>
       <w:r>
         <w:rPr>
           <w:rFonts w:ascii="宋体" w:hAnsi="宋体" w:eastAsia="宋体"/>
+          <w:b w:val="0"/>
           <w:sz w:val="21"/>
         </w:rPr>
-        <w:t>辑如下：</w:t>
+        <w:t>为了保证翻译的准确性，本实验采用了基于抽象语法树（AST）的访问者遍历方案。具体逻辑如下：</w:t>
       </w:r>
     </w:p>
     <w:p>
       <w:pPr>
-        <w:spacing w:after="40" w:line="80" w:lineRule="exact"/>
-      </w:pPr>
-    </w:p>
-    <w:p>
-      <w:pPr>
-        <w:spacing w:after="60" w:line="300" w:lineRule="exact"/>
+        <w:spacing w:line="300" w:lineRule="exact" w:after="60"/>
         <w:ind w:firstLine="420"/>
       </w:pPr>
       <w:r>
         <w:rPr>
           <w:rFonts w:ascii="宋体" w:hAnsi="宋体" w:eastAsia="宋体"/>
+          <w:b w:val="0"/>
           <w:sz w:val="21"/>
         </w:rPr>
-        <w:t>1. 表达式优先级管理：通过下降解析器构建出严格遵循运算符结合律与优先级的 AST。特别</w:t>
+        <w:t>1. 表达式优先级管理：通过下降解析器构建出严格遵循运算符结合律与优先级的 AST。特别地，针对布尔逻辑运算符（&amp;&amp;, ||, !）采用了“双重翻译策略”：在赋值语句中作为常规二元运算求值，在控制流语句中则触发短路跳转逻辑。</w:t>
       </w:r>
     </w:p>
     <w:p>
       <w:pPr>
-        <w:spacing w:after="60" w:line="300" w:lineRule="exact"/>
+        <w:spacing w:line="300" w:lineRule="exact" w:after="60"/>
         <w:ind w:firstLine="420"/>
       </w:pPr>
       <w:r>
         <w:rPr>
           <w:rFonts w:ascii="宋体" w:hAnsi="宋体" w:eastAsia="宋体"/>
+          <w:b w:val="0"/>
           <w:sz w:val="21"/>
         </w:rPr>
-        <w:t>地，针对布尔逻辑运算符（&amp;&amp;, ||, !）采用了“双重翻译策略”：在赋值语句中作为常规二元运算</w:t>
+        <w:t>2. 控制流与回填（Backpatching）：采用拉链回填技术。在处理 if、while、for 等结构时，先生成目标地址未知的跳转指令，并将其索引记录在 truelist 或 falselist 中，待目标标号确定后再统一进行地址更新。</w:t>
       </w:r>
     </w:p>
     <w:p>
       <w:pPr>
-        <w:spacing w:after="60" w:line="300" w:lineRule="exact"/>
+        <w:spacing w:line="300" w:lineRule="exact" w:after="60"/>
         <w:ind w:firstLine="420"/>
       </w:pPr>
       <w:r>
         <w:rPr>
           <w:rFonts w:ascii="宋体" w:hAnsi="宋体" w:eastAsia="宋体"/>
+          <w:b w:val="0"/>
           <w:sz w:val="21"/>
         </w:rPr>
-        <w:t>求值，在控制流语句中则触发短路跳转逻辑。</w:t>
+        <w:t>3. 函数调用规范：严格遵循 para 传参和 call 调用的四元式顺序，确保局部作用域内的变量通过四元式序列能够正确地与函数入口衔接。</w:t>
       </w:r>
     </w:p>
     <w:p>
       <w:pPr>
-        <w:spacing w:after="40" w:line="80" w:lineRule="exact"/>
-      </w:pPr>
-    </w:p>
-    <w:p>
-      <w:pPr>
-        <w:spacing w:after="20" w:line="240" w:lineRule="exact"/>
-      </w:pPr>
-      <w:r>
-        <w:rPr>
-          <w:rFonts w:ascii="Consolas" w:hAnsi="Consolas" w:eastAsia="宋体"/>
-          <w:sz w:val="16"/>
-        </w:rPr>
-        <w:t xml:space="preserve">   2. 控制流与回填（Backpatching）：                                              采用拉链回填技术。在处理 if、while、for 等结构</w:t>
-      </w:r>
-    </w:p>
-    <w:p>
-      <w:pPr>
-        <w:spacing w:after="60" w:line="300" w:lineRule="exact"/>
-        <w:ind w:firstLine="420"/>
-      </w:pPr>
-      <w:r>
-        <w:rPr>
-          <w:rFonts w:ascii="宋体" w:hAnsi="宋体" w:eastAsia="宋体"/>
-          <w:sz w:val="21"/>
-        </w:rPr>
-        <w:t>时，先生成目标地址未知的跳转指令，并将其索引记录在 truelist 或 falselist 中，待目标</w:t>
-      </w:r>
-    </w:p>
-    <w:p>
-      <w:pPr>
-        <w:spacing w:after="60" w:line="300" w:lineRule="exact"/>
-        <w:ind w:firstLine="420"/>
-      </w:pPr>
-      <w:r>
-        <w:rPr>
-          <w:rFonts w:ascii="宋体" w:hAnsi="宋体" w:eastAsia="宋体"/>
-          <w:sz w:val="21"/>
-        </w:rPr>
-        <w:t>标号确定后再统一进行地址更新。</w:t>
-      </w:r>
-    </w:p>
-    <w:p>
-      <w:pPr>
-        <w:spacing w:after="40" w:line="80" w:lineRule="exact"/>
-      </w:pPr>
-    </w:p>
-    <w:p>
-      <w:pPr>
-        <w:spacing w:after="60" w:line="300" w:lineRule="exact"/>
-        <w:ind w:firstLine="420"/>
-      </w:pPr>
-      <w:r>
-        <w:rPr>
-          <w:rFonts w:ascii="宋体" w:hAnsi="宋体" w:eastAsia="宋体"/>
-          <w:sz w:val="21"/>
-        </w:rPr>
-        <w:t>3. 函数调用规范：严格遵循 para 传参和 call 调用的四元式顺序，确保局部作用域内的变</w:t>
-      </w:r>
-    </w:p>
-    <w:p>
-      <w:pPr>
-        <w:spacing w:after="60" w:line="300" w:lineRule="exact"/>
-        <w:ind w:firstLine="420"/>
-      </w:pPr>
-      <w:r>
-        <w:rPr>
-          <w:rFonts w:ascii="宋体" w:hAnsi="宋体" w:eastAsia="宋体"/>
-          <w:sz w:val="21"/>
-        </w:rPr>
-        <w:t>量通过四元式序列能够正确地与函数入口衔接。</w:t>
-      </w:r>
-    </w:p>
-    <w:p>
-      <w:pPr>
-        <w:spacing w:after="40" w:line="80" w:lineRule="exact"/>
-      </w:pPr>
-    </w:p>
-    <w:p>
-      <w:pPr>
-        <w:spacing w:after="80" w:line="300" w:lineRule="exact" w:before="100"/>
+        <w:spacing w:before="100" w:after="100"/>
       </w:pPr>
       <w:r>
         <w:rPr>
@@ -969,123 +746,291 @@
         <w:t>3.2 方案对比分析</w:t>
       </w:r>
     </w:p>
+    <w:tbl>
+      <w:tblPr>
+        <w:tblStyle w:val="TableGrid"/>
+        <w:tblW w:type="auto" w:w="0"/>
+        <w:jc w:val="center"/>
+        <w:tblLayout w:type="fixed"/>
+        <w:tblLook w:firstColumn="1" w:firstRow="1" w:lastColumn="0" w:lastRow="0" w:noHBand="0" w:noVBand="1" w:val="04A0"/>
+      </w:tblPr>
+      <w:tblGrid>
+        <w:gridCol w:w="3081"/>
+        <w:gridCol w:w="3081"/>
+        <w:gridCol w:w="3081"/>
+      </w:tblGrid>
+      <w:tr>
+        <w:tc>
+          <w:tcPr>
+            <w:tcW w:type="dxa" w:w="1701"/>
+            <w:shd w:fill="D9EAF7"/>
+            <w:vAlign w:val="center"/>
+          </w:tcPr>
+          <w:p>
+            <w:pPr>
+              <w:spacing w:after="0" w:line="240" w:lineRule="exact"/>
+              <w:jc w:val="center"/>
+            </w:pPr>
+            <w:r/>
+            <w:r>
+              <w:rPr>
+                <w:rFonts w:ascii="宋体" w:hAnsi="宋体" w:eastAsia="宋体"/>
+                <w:b/>
+                <w:sz w:val="18"/>
+              </w:rPr>
+              <w:t>维度</w:t>
+            </w:r>
+          </w:p>
+        </w:tc>
+        <w:tc>
+          <w:tcPr>
+            <w:tcW w:type="dxa" w:w="3402"/>
+            <w:shd w:fill="D9EAF7"/>
+            <w:vAlign w:val="center"/>
+          </w:tcPr>
+          <w:p>
+            <w:pPr>
+              <w:spacing w:after="0" w:line="240" w:lineRule="exact"/>
+              <w:jc w:val="center"/>
+            </w:pPr>
+            <w:r/>
+            <w:r>
+              <w:rPr>
+                <w:rFonts w:ascii="宋体" w:hAnsi="宋体" w:eastAsia="宋体"/>
+                <w:b/>
+                <w:sz w:val="18"/>
+              </w:rPr>
+              <w:t>单遍 SDT 方案</w:t>
+            </w:r>
+          </w:p>
+        </w:tc>
+        <w:tc>
+          <w:tcPr>
+            <w:tcW w:type="dxa" w:w="3969"/>
+            <w:shd w:fill="D9EAF7"/>
+            <w:vAlign w:val="center"/>
+          </w:tcPr>
+          <w:p>
+            <w:pPr>
+              <w:spacing w:after="0" w:line="240" w:lineRule="exact"/>
+              <w:jc w:val="center"/>
+            </w:pPr>
+            <w:r/>
+            <w:r>
+              <w:rPr>
+                <w:rFonts w:ascii="宋体" w:hAnsi="宋体" w:eastAsia="宋体"/>
+                <w:b/>
+                <w:sz w:val="18"/>
+              </w:rPr>
+              <w:t>AST 遍历方案（本实验选择）</w:t>
+            </w:r>
+          </w:p>
+        </w:tc>
+      </w:tr>
+      <w:tr>
+        <w:tc>
+          <w:tcPr>
+            <w:tcW w:type="dxa" w:w="1701"/>
+            <w:vAlign w:val="center"/>
+          </w:tcPr>
+          <w:p>
+            <w:pPr>
+              <w:spacing w:after="0" w:line="240" w:lineRule="exact"/>
+              <w:jc w:val="center"/>
+            </w:pPr>
+            <w:r/>
+            <w:r>
+              <w:rPr>
+                <w:rFonts w:ascii="宋体" w:hAnsi="宋体" w:eastAsia="宋体"/>
+                <w:b w:val="0"/>
+                <w:sz w:val="17"/>
+              </w:rPr>
+              <w:t>逻辑耦合度</w:t>
+            </w:r>
+          </w:p>
+        </w:tc>
+        <w:tc>
+          <w:tcPr>
+            <w:tcW w:type="dxa" w:w="3402"/>
+            <w:vAlign w:val="center"/>
+          </w:tcPr>
+          <w:p>
+            <w:pPr>
+              <w:spacing w:after="0" w:line="240" w:lineRule="exact"/>
+              <w:jc w:val="left"/>
+            </w:pPr>
+            <w:r/>
+            <w:r>
+              <w:rPr>
+                <w:rFonts w:ascii="宋体" w:hAnsi="宋体" w:eastAsia="宋体"/>
+                <w:b w:val="0"/>
+                <w:sz w:val="17"/>
+              </w:rPr>
+              <w:t>语法分析与代码生成高度耦合，不便调试。</w:t>
+            </w:r>
+          </w:p>
+        </w:tc>
+        <w:tc>
+          <w:tcPr>
+            <w:tcW w:type="dxa" w:w="3969"/>
+            <w:vAlign w:val="center"/>
+          </w:tcPr>
+          <w:p>
+            <w:pPr>
+              <w:spacing w:after="0" w:line="240" w:lineRule="exact"/>
+              <w:jc w:val="center"/>
+            </w:pPr>
+            <w:r/>
+            <w:r>
+              <w:rPr>
+                <w:rFonts w:ascii="宋体" w:hAnsi="宋体" w:eastAsia="宋体"/>
+                <w:b w:val="0"/>
+                <w:sz w:val="17"/>
+              </w:rPr>
+              <w:t>模块化程度高，语法树构建与代码生成完全解耦。</w:t>
+            </w:r>
+          </w:p>
+        </w:tc>
+      </w:tr>
+      <w:tr>
+        <w:tc>
+          <w:tcPr>
+            <w:tcW w:type="dxa" w:w="1701"/>
+            <w:vAlign w:val="center"/>
+          </w:tcPr>
+          <w:p>
+            <w:pPr>
+              <w:spacing w:after="0" w:line="240" w:lineRule="exact"/>
+              <w:jc w:val="center"/>
+            </w:pPr>
+            <w:r/>
+            <w:r>
+              <w:rPr>
+                <w:rFonts w:ascii="宋体" w:hAnsi="宋体" w:eastAsia="宋体"/>
+                <w:b w:val="0"/>
+                <w:sz w:val="17"/>
+              </w:rPr>
+              <w:t>短路求值处理</w:t>
+            </w:r>
+          </w:p>
+        </w:tc>
+        <w:tc>
+          <w:tcPr>
+            <w:tcW w:type="dxa" w:w="3402"/>
+            <w:vAlign w:val="center"/>
+          </w:tcPr>
+          <w:p>
+            <w:pPr>
+              <w:spacing w:after="0" w:line="240" w:lineRule="exact"/>
+              <w:jc w:val="left"/>
+            </w:pPr>
+            <w:r/>
+            <w:r>
+              <w:rPr>
+                <w:rFonts w:ascii="宋体" w:hAnsi="宋体" w:eastAsia="宋体"/>
+                <w:b w:val="0"/>
+                <w:sz w:val="17"/>
+              </w:rPr>
+              <w:t>在解析过程中处理回填链条极其复杂。</w:t>
+            </w:r>
+          </w:p>
+        </w:tc>
+        <w:tc>
+          <w:tcPr>
+            <w:tcW w:type="dxa" w:w="3969"/>
+            <w:vAlign w:val="center"/>
+          </w:tcPr>
+          <w:p>
+            <w:pPr>
+              <w:spacing w:after="0" w:line="240" w:lineRule="exact"/>
+              <w:jc w:val="center"/>
+            </w:pPr>
+            <w:r/>
+            <w:r>
+              <w:rPr>
+                <w:rFonts w:ascii="宋体" w:hAnsi="宋体" w:eastAsia="宋体"/>
+                <w:b w:val="0"/>
+                <w:sz w:val="17"/>
+              </w:rPr>
+              <w:t>处理自然，可根据父节点类型决定子树的翻译模式。</w:t>
+            </w:r>
+          </w:p>
+        </w:tc>
+      </w:tr>
+      <w:tr>
+        <w:tc>
+          <w:tcPr>
+            <w:tcW w:type="dxa" w:w="1701"/>
+            <w:vAlign w:val="center"/>
+          </w:tcPr>
+          <w:p>
+            <w:pPr>
+              <w:spacing w:after="0" w:line="240" w:lineRule="exact"/>
+              <w:jc w:val="center"/>
+            </w:pPr>
+            <w:r/>
+            <w:r>
+              <w:rPr>
+                <w:rFonts w:ascii="宋体" w:hAnsi="宋体" w:eastAsia="宋体"/>
+                <w:b w:val="0"/>
+                <w:sz w:val="17"/>
+              </w:rPr>
+              <w:t>右结合赋值</w:t>
+            </w:r>
+          </w:p>
+        </w:tc>
+        <w:tc>
+          <w:tcPr>
+            <w:tcW w:type="dxa" w:w="3402"/>
+            <w:vAlign w:val="center"/>
+          </w:tcPr>
+          <w:p>
+            <w:pPr>
+              <w:spacing w:after="0" w:line="240" w:lineRule="exact"/>
+              <w:jc w:val="left"/>
+            </w:pPr>
+            <w:r/>
+            <w:r>
+              <w:rPr>
+                <w:rFonts w:ascii="宋体" w:hAnsi="宋体" w:eastAsia="宋体"/>
+                <w:b w:val="0"/>
+                <w:sz w:val="17"/>
+              </w:rPr>
+              <w:t>难以直接处理 a = b = 0 等连续赋值。</w:t>
+            </w:r>
+          </w:p>
+        </w:tc>
+        <w:tc>
+          <w:tcPr>
+            <w:tcW w:type="dxa" w:w="3969"/>
+            <w:vAlign w:val="center"/>
+          </w:tcPr>
+          <w:p>
+            <w:pPr>
+              <w:spacing w:after="0" w:line="240" w:lineRule="exact"/>
+              <w:jc w:val="center"/>
+            </w:pPr>
+            <w:r/>
+            <w:r>
+              <w:rPr>
+                <w:rFonts w:ascii="宋体" w:hAnsi="宋体" w:eastAsia="宋体"/>
+                <w:b w:val="0"/>
+                <w:sz w:val="17"/>
+              </w:rPr>
+              <w:t>天然支持，通过树的后序遍历轻松实现右结合逻辑。</w:t>
+            </w:r>
+          </w:p>
+        </w:tc>
+      </w:tr>
+    </w:tbl>
     <w:p>
       <w:pPr>
-        <w:spacing w:after="40" w:line="80" w:lineRule="exact"/>
+        <w:spacing w:after="80"/>
       </w:pPr>
     </w:p>
     <w:p>
       <w:pPr>
-        <w:spacing w:after="40" w:line="80" w:lineRule="exact"/>
-      </w:pPr>
-    </w:p>
-    <w:p>
-      <w:pPr>
-        <w:spacing w:after="20" w:line="240" w:lineRule="exact"/>
-      </w:pPr>
-      <w:r>
-        <w:rPr>
-          <w:rFonts w:ascii="Consolas" w:hAnsi="Consolas" w:eastAsia="宋体"/>
-          <w:sz w:val="16"/>
-        </w:rPr>
-        <w:t xml:space="preserve">   维度                         单遍 SDT 方案                                   AST 遍历方案（本实验选择）</w:t>
-      </w:r>
-    </w:p>
-    <w:p>
-      <w:pPr>
-        <w:spacing w:after="40" w:line="80" w:lineRule="exact"/>
-      </w:pPr>
-    </w:p>
-    <w:p>
-      <w:pPr>
-        <w:spacing w:after="20" w:line="240" w:lineRule="exact"/>
-      </w:pPr>
-      <w:r>
-        <w:rPr>
-          <w:rFonts w:ascii="Consolas" w:hAnsi="Consolas" w:eastAsia="宋体"/>
-          <w:sz w:val="16"/>
-        </w:rPr>
-        <w:t xml:space="preserve"> 逻辑耦合度    语法分析与代码生成高度耦合，不便           模块化程度高，语法树构建与代码生成完全</w:t>
-      </w:r>
-    </w:p>
-    <w:p>
-      <w:pPr>
-        <w:spacing w:after="20" w:line="240" w:lineRule="exact"/>
-      </w:pPr>
-      <w:r>
-        <w:rPr>
-          <w:rFonts w:ascii="Consolas" w:hAnsi="Consolas" w:eastAsia="宋体"/>
-          <w:sz w:val="16"/>
-        </w:rPr>
-        <w:t xml:space="preserve">                    调试。                          解耦。</w:t>
-      </w:r>
-    </w:p>
-    <w:p>
-      <w:r>
-        <w:br w:type="page"/>
-      </w:r>
-    </w:p>
-    <w:p>
-      <w:pPr>
-        <w:spacing w:after="20" w:line="240" w:lineRule="exact"/>
-      </w:pPr>
-      <w:r>
-        <w:rPr>
-          <w:rFonts w:ascii="Consolas" w:hAnsi="Consolas" w:eastAsia="宋体"/>
-          <w:sz w:val="16"/>
-        </w:rPr>
-        <w:t xml:space="preserve"> 短路求值处      在解析过程中处理回填链条极其复             处理自然，可根据父节点类型决定子树的翻</w:t>
-      </w:r>
-    </w:p>
-    <w:p>
-      <w:pPr>
-        <w:spacing w:after="20" w:line="240" w:lineRule="exact"/>
-      </w:pPr>
-      <w:r>
-        <w:rPr>
-          <w:rFonts w:ascii="Consolas" w:hAnsi="Consolas" w:eastAsia="宋体"/>
-          <w:sz w:val="16"/>
-        </w:rPr>
-        <w:t xml:space="preserve">    理                  杂。                            译模式。</w:t>
-      </w:r>
-    </w:p>
-    <w:p>
-      <w:pPr>
-        <w:spacing w:after="40" w:line="80" w:lineRule="exact"/>
-      </w:pPr>
-    </w:p>
-    <w:p>
-      <w:pPr>
-        <w:spacing w:after="20" w:line="240" w:lineRule="exact"/>
-      </w:pPr>
-      <w:r>
-        <w:rPr>
-          <w:rFonts w:ascii="Consolas" w:hAnsi="Consolas" w:eastAsia="宋体"/>
-          <w:sz w:val="16"/>
-        </w:rPr>
-        <w:t xml:space="preserve"> 右结合赋值       难以直接处理 a = b = 0 等连续赋      天然支持，通过树的后序遍历轻松实现右结</w:t>
-      </w:r>
-    </w:p>
-    <w:p>
-      <w:pPr>
-        <w:spacing w:after="20" w:line="240" w:lineRule="exact"/>
-      </w:pPr>
-      <w:r>
-        <w:rPr>
-          <w:rFonts w:ascii="Consolas" w:hAnsi="Consolas" w:eastAsia="宋体"/>
-          <w:sz w:val="16"/>
-        </w:rPr>
-        <w:t xml:space="preserve">                       值。                            合逻辑。</w:t>
-      </w:r>
-    </w:p>
-    <w:p>
-      <w:pPr>
-        <w:spacing w:after="40" w:line="80" w:lineRule="exact"/>
-      </w:pPr>
-    </w:p>
-    <w:p>
-      <w:pPr>
-        <w:spacing w:after="120" w:line="300" w:lineRule="exact" w:before="160"/>
+        <w:spacing w:before="160" w:after="100"/>
       </w:pPr>
       <w:r>
         <w:rPr>
@@ -1098,227 +1043,571 @@
     </w:p>
     <w:p>
       <w:pPr>
-        <w:spacing w:after="40" w:line="80" w:lineRule="exact"/>
-      </w:pPr>
-    </w:p>
-    <w:p>
-      <w:pPr>
-        <w:spacing w:after="60" w:line="300" w:lineRule="exact"/>
+        <w:spacing w:line="300" w:lineRule="exact" w:after="60"/>
         <w:ind w:firstLine="420"/>
       </w:pPr>
       <w:r>
         <w:rPr>
           <w:rFonts w:ascii="宋体" w:hAnsi="宋体" w:eastAsia="宋体"/>
+          <w:b w:val="0"/>
           <w:sz w:val="21"/>
         </w:rPr>
-        <w:t>在开发过程中，我们预先分析了 Sample 语言可能存在的复杂应用场景，并针对性地优化了</w:t>
+        <w:t>在开发过程中，我们预先分析了 Sample 语言可能存在的复杂应用场景，并针对性地优化了生成逻辑。通过对五类典型代码片段的自动化验证，证明了本方案的稳健性：</w:t>
       </w:r>
     </w:p>
+    <w:tbl>
+      <w:tblPr>
+        <w:tblStyle w:val="TableGrid"/>
+        <w:tblW w:type="auto" w:w="0"/>
+        <w:jc w:val="center"/>
+        <w:tblLayout w:type="fixed"/>
+        <w:tblLook w:firstColumn="1" w:firstRow="1" w:lastColumn="0" w:lastRow="0" w:noHBand="0" w:noVBand="1" w:val="04A0"/>
+      </w:tblPr>
+      <w:tblGrid>
+        <w:gridCol w:w="2310"/>
+        <w:gridCol w:w="2310"/>
+        <w:gridCol w:w="2310"/>
+        <w:gridCol w:w="2310"/>
+      </w:tblGrid>
+      <w:tr>
+        <w:tc>
+          <w:tcPr>
+            <w:tcW w:type="dxa" w:w="1247"/>
+            <w:shd w:fill="D9EAF7"/>
+            <w:vAlign w:val="center"/>
+          </w:tcPr>
+          <w:p>
+            <w:pPr>
+              <w:spacing w:after="0" w:line="240" w:lineRule="exact"/>
+              <w:jc w:val="center"/>
+            </w:pPr>
+            <w:r/>
+            <w:r>
+              <w:rPr>
+                <w:rFonts w:ascii="宋体" w:hAnsi="宋体" w:eastAsia="宋体"/>
+                <w:b/>
+                <w:sz w:val="18"/>
+              </w:rPr>
+              <w:t>场景类别</w:t>
+            </w:r>
+          </w:p>
+        </w:tc>
+        <w:tc>
+          <w:tcPr>
+            <w:tcW w:type="dxa" w:w="3458"/>
+            <w:shd w:fill="D9EAF7"/>
+            <w:vAlign w:val="center"/>
+          </w:tcPr>
+          <w:p>
+            <w:pPr>
+              <w:spacing w:after="0" w:line="240" w:lineRule="exact"/>
+              <w:jc w:val="center"/>
+            </w:pPr>
+            <w:r/>
+            <w:r>
+              <w:rPr>
+                <w:rFonts w:ascii="宋体" w:hAnsi="宋体" w:eastAsia="宋体"/>
+                <w:b/>
+                <w:sz w:val="18"/>
+              </w:rPr>
+              <w:t>程序逻辑预判与技术对策</w:t>
+            </w:r>
+          </w:p>
+        </w:tc>
+        <w:tc>
+          <w:tcPr>
+            <w:tcW w:type="dxa" w:w="3005"/>
+            <w:shd w:fill="D9EAF7"/>
+            <w:vAlign w:val="center"/>
+          </w:tcPr>
+          <w:p>
+            <w:pPr>
+              <w:spacing w:after="0" w:line="240" w:lineRule="exact"/>
+              <w:jc w:val="center"/>
+            </w:pPr>
+            <w:r/>
+            <w:r>
+              <w:rPr>
+                <w:rFonts w:ascii="宋体" w:hAnsi="宋体" w:eastAsia="宋体"/>
+                <w:b/>
+                <w:sz w:val="18"/>
+              </w:rPr>
+              <w:t>翻译核心逻辑（部分四元式示例）</w:t>
+            </w:r>
+          </w:p>
+        </w:tc>
+        <w:tc>
+          <w:tcPr>
+            <w:tcW w:type="dxa" w:w="1134"/>
+            <w:shd w:fill="D9EAF7"/>
+            <w:vAlign w:val="center"/>
+          </w:tcPr>
+          <w:p>
+            <w:pPr>
+              <w:spacing w:after="0" w:line="240" w:lineRule="exact"/>
+              <w:jc w:val="center"/>
+            </w:pPr>
+            <w:r/>
+            <w:r>
+              <w:rPr>
+                <w:rFonts w:ascii="宋体" w:hAnsi="宋体" w:eastAsia="宋体"/>
+                <w:b/>
+                <w:sz w:val="18"/>
+              </w:rPr>
+              <w:t>验证结果</w:t>
+            </w:r>
+          </w:p>
+        </w:tc>
+      </w:tr>
+      <w:tr>
+        <w:tc>
+          <w:tcPr>
+            <w:tcW w:type="dxa" w:w="1247"/>
+            <w:vAlign w:val="center"/>
+          </w:tcPr>
+          <w:p>
+            <w:pPr>
+              <w:spacing w:after="0" w:line="240" w:lineRule="exact"/>
+              <w:jc w:val="center"/>
+            </w:pPr>
+            <w:r/>
+            <w:r>
+              <w:rPr>
+                <w:rFonts w:ascii="宋体" w:hAnsi="宋体" w:eastAsia="宋体"/>
+                <w:b w:val="0"/>
+                <w:sz w:val="17"/>
+              </w:rPr>
+              <w:t>复杂算术</w:t>
+            </w:r>
+          </w:p>
+        </w:tc>
+        <w:tc>
+          <w:tcPr>
+            <w:tcW w:type="dxa" w:w="3458"/>
+            <w:vAlign w:val="center"/>
+          </w:tcPr>
+          <w:p>
+            <w:pPr>
+              <w:spacing w:after="0" w:line="240" w:lineRule="exact"/>
+              <w:jc w:val="left"/>
+            </w:pPr>
+            <w:r/>
+            <w:r>
+              <w:rPr>
+                <w:rFonts w:ascii="宋体" w:hAnsi="宋体" w:eastAsia="宋体"/>
+                <w:b w:val="0"/>
+                <w:sz w:val="17"/>
+              </w:rPr>
+              <w:t>考虑到长表达式中运算符优先级和括号的深度嵌套。采用后序遍历，确保临时变量自增顺序。</w:t>
+            </w:r>
+          </w:p>
+        </w:tc>
+        <w:tc>
+          <w:tcPr>
+            <w:tcW w:type="dxa" w:w="3005"/>
+            <w:vAlign w:val="center"/>
+          </w:tcPr>
+          <w:p>
+            <w:pPr>
+              <w:spacing w:after="0" w:line="240" w:lineRule="exact"/>
+              <w:jc w:val="left"/>
+            </w:pPr>
+            <w:r/>
+            <w:r>
+              <w:rPr>
+                <w:rFonts w:ascii="宋体" w:hAnsi="宋体" w:eastAsia="宋体"/>
+                <w:b w:val="0"/>
+                <w:sz w:val="17"/>
+              </w:rPr>
+              <w:t>('+', 'a', 'b', 't1')</w:t>
+              <w:br/>
+              <w:t>('-', 't1', 't3', 't4')</w:t>
+            </w:r>
+          </w:p>
+        </w:tc>
+        <w:tc>
+          <w:tcPr>
+            <w:tcW w:type="dxa" w:w="1134"/>
+            <w:vAlign w:val="center"/>
+          </w:tcPr>
+          <w:p>
+            <w:pPr>
+              <w:spacing w:after="0" w:line="240" w:lineRule="exact"/>
+              <w:jc w:val="center"/>
+            </w:pPr>
+            <w:r/>
+            <w:r>
+              <w:rPr>
+                <w:rFonts w:ascii="宋体" w:hAnsi="宋体" w:eastAsia="宋体"/>
+                <w:b w:val="0"/>
+                <w:sz w:val="17"/>
+              </w:rPr>
+              <w:t>符合预期</w:t>
+            </w:r>
+          </w:p>
+        </w:tc>
+      </w:tr>
+      <w:tr>
+        <w:tc>
+          <w:tcPr>
+            <w:tcW w:type="dxa" w:w="1247"/>
+            <w:vAlign w:val="center"/>
+          </w:tcPr>
+          <w:p>
+            <w:pPr>
+              <w:spacing w:after="0" w:line="240" w:lineRule="exact"/>
+              <w:jc w:val="center"/>
+            </w:pPr>
+            <w:r/>
+            <w:r>
+              <w:rPr>
+                <w:rFonts w:ascii="宋体" w:hAnsi="宋体" w:eastAsia="宋体"/>
+                <w:b w:val="0"/>
+                <w:sz w:val="17"/>
+              </w:rPr>
+              <w:t>逻辑计算</w:t>
+            </w:r>
+          </w:p>
+        </w:tc>
+        <w:tc>
+          <w:tcPr>
+            <w:tcW w:type="dxa" w:w="3458"/>
+            <w:vAlign w:val="center"/>
+          </w:tcPr>
+          <w:p>
+            <w:pPr>
+              <w:spacing w:after="0" w:line="240" w:lineRule="exact"/>
+              <w:jc w:val="left"/>
+            </w:pPr>
+            <w:r/>
+            <w:r>
+              <w:rPr>
+                <w:rFonts w:ascii="宋体" w:hAnsi="宋体" w:eastAsia="宋体"/>
+                <w:b w:val="0"/>
+                <w:sz w:val="17"/>
+              </w:rPr>
+              <w:t>分析得出赋值语句中的布尔运算不应产生跳转，而是作为普通计算。引入布尔值求值节点。</w:t>
+            </w:r>
+          </w:p>
+        </w:tc>
+        <w:tc>
+          <w:tcPr>
+            <w:tcW w:type="dxa" w:w="3005"/>
+            <w:vAlign w:val="center"/>
+          </w:tcPr>
+          <w:p>
+            <w:pPr>
+              <w:spacing w:after="0" w:line="240" w:lineRule="exact"/>
+              <w:jc w:val="left"/>
+            </w:pPr>
+            <w:r/>
+            <w:r>
+              <w:rPr>
+                <w:rFonts w:ascii="宋体" w:hAnsi="宋体" w:eastAsia="宋体"/>
+                <w:b w:val="0"/>
+                <w:sz w:val="17"/>
+              </w:rPr>
+              <w:t>('&amp;&amp;', 't2', 't3', 't4')</w:t>
+              <w:br/>
+              <w:t>('||', 't4', 't7', 't8')</w:t>
+            </w:r>
+          </w:p>
+        </w:tc>
+        <w:tc>
+          <w:tcPr>
+            <w:tcW w:type="dxa" w:w="1134"/>
+            <w:vAlign w:val="center"/>
+          </w:tcPr>
+          <w:p>
+            <w:pPr>
+              <w:spacing w:after="0" w:line="240" w:lineRule="exact"/>
+              <w:jc w:val="center"/>
+            </w:pPr>
+            <w:r/>
+            <w:r>
+              <w:rPr>
+                <w:rFonts w:ascii="宋体" w:hAnsi="宋体" w:eastAsia="宋体"/>
+                <w:b w:val="0"/>
+                <w:sz w:val="17"/>
+              </w:rPr>
+              <w:t>符合预期</w:t>
+            </w:r>
+          </w:p>
+        </w:tc>
+      </w:tr>
+      <w:tr>
+        <w:tc>
+          <w:tcPr>
+            <w:tcW w:type="dxa" w:w="1247"/>
+            <w:vAlign w:val="center"/>
+          </w:tcPr>
+          <w:p>
+            <w:pPr>
+              <w:spacing w:after="0" w:line="240" w:lineRule="exact"/>
+              <w:jc w:val="center"/>
+            </w:pPr>
+            <w:r/>
+            <w:r>
+              <w:rPr>
+                <w:rFonts w:ascii="宋体" w:hAnsi="宋体" w:eastAsia="宋体"/>
+                <w:b w:val="0"/>
+                <w:sz w:val="17"/>
+              </w:rPr>
+              <w:t>短路控制流</w:t>
+            </w:r>
+          </w:p>
+        </w:tc>
+        <w:tc>
+          <w:tcPr>
+            <w:tcW w:type="dxa" w:w="3458"/>
+            <w:vAlign w:val="center"/>
+          </w:tcPr>
+          <w:p>
+            <w:pPr>
+              <w:spacing w:after="0" w:line="240" w:lineRule="exact"/>
+              <w:jc w:val="left"/>
+            </w:pPr>
+            <w:r/>
+            <w:r>
+              <w:rPr>
+                <w:rFonts w:ascii="宋体" w:hAnsi="宋体" w:eastAsia="宋体"/>
+                <w:b w:val="0"/>
+                <w:sz w:val="17"/>
+              </w:rPr>
+              <w:t>关键难点：预判到 if/while 条件中的逻辑运算符需翻译为跳转。利用 truelist 进行拉链管理。</w:t>
+            </w:r>
+          </w:p>
+        </w:tc>
+        <w:tc>
+          <w:tcPr>
+            <w:tcW w:type="dxa" w:w="3005"/>
+            <w:vAlign w:val="center"/>
+          </w:tcPr>
+          <w:p>
+            <w:pPr>
+              <w:spacing w:after="0" w:line="240" w:lineRule="exact"/>
+              <w:jc w:val="left"/>
+            </w:pPr>
+            <w:r/>
+            <w:r>
+              <w:rPr>
+                <w:rFonts w:ascii="宋体" w:hAnsi="宋体" w:eastAsia="宋体"/>
+                <w:b w:val="0"/>
+                <w:sz w:val="17"/>
+              </w:rPr>
+              <w:t>('J&gt;', 'x', '0', 5)</w:t>
+              <w:br/>
+              <w:t>('J', '_', '_', 9)</w:t>
+            </w:r>
+          </w:p>
+        </w:tc>
+        <w:tc>
+          <w:tcPr>
+            <w:tcW w:type="dxa" w:w="1134"/>
+            <w:vAlign w:val="center"/>
+          </w:tcPr>
+          <w:p>
+            <w:pPr>
+              <w:spacing w:after="0" w:line="240" w:lineRule="exact"/>
+              <w:jc w:val="center"/>
+            </w:pPr>
+            <w:r/>
+            <w:r>
+              <w:rPr>
+                <w:rFonts w:ascii="宋体" w:hAnsi="宋体" w:eastAsia="宋体"/>
+                <w:b w:val="0"/>
+                <w:sz w:val="17"/>
+              </w:rPr>
+              <w:t>符合预期</w:t>
+            </w:r>
+          </w:p>
+        </w:tc>
+      </w:tr>
+      <w:tr>
+        <w:tc>
+          <w:tcPr>
+            <w:tcW w:type="dxa" w:w="1247"/>
+            <w:vAlign w:val="center"/>
+          </w:tcPr>
+          <w:p>
+            <w:pPr>
+              <w:spacing w:after="0" w:line="240" w:lineRule="exact"/>
+              <w:jc w:val="center"/>
+            </w:pPr>
+            <w:r/>
+            <w:r>
+              <w:rPr>
+                <w:rFonts w:ascii="宋体" w:hAnsi="宋体" w:eastAsia="宋体"/>
+                <w:b w:val="0"/>
+                <w:sz w:val="17"/>
+              </w:rPr>
+              <w:t>嵌套循环</w:t>
+            </w:r>
+          </w:p>
+        </w:tc>
+        <w:tc>
+          <w:tcPr>
+            <w:tcW w:type="dxa" w:w="3458"/>
+            <w:vAlign w:val="center"/>
+          </w:tcPr>
+          <w:p>
+            <w:pPr>
+              <w:spacing w:after="0" w:line="240" w:lineRule="exact"/>
+              <w:jc w:val="left"/>
+            </w:pPr>
+            <w:r/>
+            <w:r>
+              <w:rPr>
+                <w:rFonts w:ascii="宋体" w:hAnsi="宋体" w:eastAsia="宋体"/>
+                <w:b w:val="0"/>
+                <w:sz w:val="17"/>
+              </w:rPr>
+              <w:t>分析多重循环下的 break/continue 逻辑。采用循环状态栈管理回填链，支持精准跳出。</w:t>
+            </w:r>
+          </w:p>
+        </w:tc>
+        <w:tc>
+          <w:tcPr>
+            <w:tcW w:type="dxa" w:w="3005"/>
+            <w:vAlign w:val="center"/>
+          </w:tcPr>
+          <w:p>
+            <w:pPr>
+              <w:spacing w:after="0" w:line="240" w:lineRule="exact"/>
+              <w:jc w:val="left"/>
+            </w:pPr>
+            <w:r/>
+            <w:r>
+              <w:rPr>
+                <w:rFonts w:ascii="宋体" w:hAnsi="宋体" w:eastAsia="宋体"/>
+                <w:b w:val="0"/>
+                <w:sz w:val="17"/>
+              </w:rPr>
+              <w:t>('J', '_', '_', loop_start)</w:t>
+              <w:br/>
+              <w:t>('J', '_', '_', loop_end)</w:t>
+            </w:r>
+          </w:p>
+        </w:tc>
+        <w:tc>
+          <w:tcPr>
+            <w:tcW w:type="dxa" w:w="1134"/>
+            <w:vAlign w:val="center"/>
+          </w:tcPr>
+          <w:p>
+            <w:pPr>
+              <w:spacing w:after="0" w:line="240" w:lineRule="exact"/>
+              <w:jc w:val="center"/>
+            </w:pPr>
+            <w:r/>
+            <w:r>
+              <w:rPr>
+                <w:rFonts w:ascii="宋体" w:hAnsi="宋体" w:eastAsia="宋体"/>
+                <w:b w:val="0"/>
+                <w:sz w:val="17"/>
+              </w:rPr>
+              <w:t>符合预期</w:t>
+            </w:r>
+          </w:p>
+        </w:tc>
+      </w:tr>
+      <w:tr>
+        <w:tc>
+          <w:tcPr>
+            <w:tcW w:type="dxa" w:w="1247"/>
+            <w:vAlign w:val="center"/>
+          </w:tcPr>
+          <w:p>
+            <w:pPr>
+              <w:spacing w:after="0" w:line="240" w:lineRule="exact"/>
+              <w:jc w:val="center"/>
+            </w:pPr>
+            <w:r/>
+            <w:r>
+              <w:rPr>
+                <w:rFonts w:ascii="宋体" w:hAnsi="宋体" w:eastAsia="宋体"/>
+                <w:b w:val="0"/>
+                <w:sz w:val="17"/>
+              </w:rPr>
+              <w:t>函数传参</w:t>
+            </w:r>
+          </w:p>
+        </w:tc>
+        <w:tc>
+          <w:tcPr>
+            <w:tcW w:type="dxa" w:w="3458"/>
+            <w:vAlign w:val="center"/>
+          </w:tcPr>
+          <w:p>
+            <w:pPr>
+              <w:spacing w:after="0" w:line="240" w:lineRule="exact"/>
+              <w:jc w:val="left"/>
+            </w:pPr>
+            <w:r/>
+            <w:r>
+              <w:rPr>
+                <w:rFonts w:ascii="宋体" w:hAnsi="宋体" w:eastAsia="宋体"/>
+                <w:b w:val="0"/>
+                <w:sz w:val="17"/>
+              </w:rPr>
+              <w:t>预判到参数压栈顺序对函数执行的影响。统一采用 para arg, _, _ 格式确保调用一致性。</w:t>
+            </w:r>
+          </w:p>
+        </w:tc>
+        <w:tc>
+          <w:tcPr>
+            <w:tcW w:type="dxa" w:w="3005"/>
+            <w:vAlign w:val="center"/>
+          </w:tcPr>
+          <w:p>
+            <w:pPr>
+              <w:spacing w:after="0" w:line="240" w:lineRule="exact"/>
+              <w:jc w:val="left"/>
+            </w:pPr>
+            <w:r/>
+            <w:r>
+              <w:rPr>
+                <w:rFonts w:ascii="宋体" w:hAnsi="宋体" w:eastAsia="宋体"/>
+                <w:b w:val="0"/>
+                <w:sz w:val="17"/>
+              </w:rPr>
+              <w:t>('para', 'g', '_', '_')</w:t>
+              <w:br/>
+              <w:t>('call', 'func', '_', 't1')</w:t>
+            </w:r>
+          </w:p>
+        </w:tc>
+        <w:tc>
+          <w:tcPr>
+            <w:tcW w:type="dxa" w:w="1134"/>
+            <w:vAlign w:val="center"/>
+          </w:tcPr>
+          <w:p>
+            <w:pPr>
+              <w:spacing w:after="0" w:line="240" w:lineRule="exact"/>
+              <w:jc w:val="center"/>
+            </w:pPr>
+            <w:r/>
+            <w:r>
+              <w:rPr>
+                <w:rFonts w:ascii="宋体" w:hAnsi="宋体" w:eastAsia="宋体"/>
+                <w:b w:val="0"/>
+                <w:sz w:val="17"/>
+              </w:rPr>
+              <w:t>符合预期</w:t>
+            </w:r>
+          </w:p>
+        </w:tc>
+      </w:tr>
+    </w:tbl>
     <w:p>
       <w:pPr>
-        <w:spacing w:after="60" w:line="300" w:lineRule="exact"/>
-        <w:ind w:firstLine="420"/>
-      </w:pPr>
-      <w:r>
-        <w:rPr>
-          <w:rFonts w:ascii="宋体" w:hAnsi="宋体" w:eastAsia="宋体"/>
-          <w:sz w:val="21"/>
-        </w:rPr>
-        <w:t>生成逻辑。通过对五类典型代码片段的自动化验证，证明了本方案的稳健性：</w:t>
-      </w:r>
-    </w:p>
-    <w:p>
-      <w:pPr>
-        <w:spacing w:after="40" w:line="80" w:lineRule="exact"/>
+        <w:spacing w:after="80"/>
       </w:pPr>
     </w:p>
     <w:p>
       <w:pPr>
-        <w:spacing w:after="40" w:line="80" w:lineRule="exact"/>
-      </w:pPr>
-    </w:p>
-    <w:p>
-      <w:pPr>
-        <w:spacing w:after="20" w:line="240" w:lineRule="exact"/>
-      </w:pPr>
-      <w:r>
-        <w:rPr>
-          <w:rFonts w:ascii="Consolas" w:hAnsi="Consolas" w:eastAsia="宋体"/>
-          <w:sz w:val="16"/>
-        </w:rPr>
-        <w:t xml:space="preserve"> 场景类                                                                 验证</w:t>
-      </w:r>
-    </w:p>
-    <w:p>
-      <w:pPr>
-        <w:spacing w:after="20" w:line="240" w:lineRule="exact"/>
-      </w:pPr>
-      <w:r>
-        <w:rPr>
-          <w:rFonts w:ascii="Consolas" w:hAnsi="Consolas" w:eastAsia="宋体"/>
-          <w:sz w:val="16"/>
-        </w:rPr>
-        <w:t xml:space="preserve">  别                             程序逻辑预判与技术对策                         翻译核心逻辑（部分四元式示例）结果</w:t>
-      </w:r>
-    </w:p>
-    <w:p>
-      <w:pPr>
-        <w:spacing w:after="40" w:line="80" w:lineRule="exact"/>
-      </w:pPr>
-    </w:p>
-    <w:p>
-      <w:pPr>
-        <w:spacing w:after="20" w:line="240" w:lineRule="exact"/>
-      </w:pPr>
-      <w:r>
-        <w:rPr>
-          <w:rFonts w:ascii="Consolas" w:hAnsi="Consolas" w:eastAsia="宋体"/>
-          <w:sz w:val="16"/>
-        </w:rPr>
-        <w:t xml:space="preserve"> 复杂算    考虑到长表达式中运算符优先级和括号的深度嵌套。采                    ('+', 'a', 'b', 't1')符合</w:t>
-      </w:r>
-    </w:p>
-    <w:p>
-      <w:pPr>
-        <w:spacing w:after="20" w:line="240" w:lineRule="exact"/>
-      </w:pPr>
-      <w:r>
-        <w:rPr>
-          <w:rFonts w:ascii="Consolas" w:hAnsi="Consolas" w:eastAsia="宋体"/>
-          <w:sz w:val="16"/>
-        </w:rPr>
-        <w:t xml:space="preserve">  术           用后序遍历，确保临时变量自增顺序。                     ('-', 't1', 't3', 't4')预期</w:t>
-      </w:r>
-    </w:p>
-    <w:p>
-      <w:pPr>
-        <w:spacing w:after="40" w:line="80" w:lineRule="exact"/>
-      </w:pPr>
-    </w:p>
-    <w:p>
-      <w:pPr>
-        <w:spacing w:after="20" w:line="240" w:lineRule="exact"/>
-      </w:pPr>
-      <w:r>
-        <w:rPr>
-          <w:rFonts w:ascii="Consolas" w:hAnsi="Consolas" w:eastAsia="宋体"/>
-          <w:sz w:val="16"/>
-        </w:rPr>
-        <w:t xml:space="preserve"> 逻辑计    分析得出赋值语句中的布尔运算不应产生跳转，而是作                   ('&amp;&amp;', 't2', 't3', 't4')符合</w:t>
-      </w:r>
-    </w:p>
-    <w:p>
-      <w:pPr>
-        <w:spacing w:after="20" w:line="240" w:lineRule="exact"/>
-      </w:pPr>
-      <w:r>
-        <w:rPr>
-          <w:rFonts w:ascii="Consolas" w:hAnsi="Consolas" w:eastAsia="宋体"/>
-          <w:sz w:val="16"/>
-        </w:rPr>
-        <w:t xml:space="preserve">  算           为普通计算。引入布尔值求值节点。                     ('||', 't4', 't7', 't8')预期</w:t>
-      </w:r>
-    </w:p>
-    <w:p>
-      <w:pPr>
-        <w:spacing w:after="40" w:line="80" w:lineRule="exact"/>
-      </w:pPr>
-    </w:p>
-    <w:p>
-      <w:pPr>
-        <w:spacing w:after="20" w:line="240" w:lineRule="exact"/>
-      </w:pPr>
-      <w:r>
-        <w:rPr>
-          <w:rFonts w:ascii="Consolas" w:hAnsi="Consolas" w:eastAsia="宋体"/>
-          <w:sz w:val="16"/>
-        </w:rPr>
-        <w:t xml:space="preserve"> 短路控    关键难点：预判到 if/while 条件中的逻辑运算符需翻译               ('J&gt;', 'x', '0', 5)符合</w:t>
-      </w:r>
-    </w:p>
-    <w:p>
-      <w:pPr>
-        <w:spacing w:after="20" w:line="240" w:lineRule="exact"/>
-      </w:pPr>
-      <w:r>
-        <w:rPr>
-          <w:rFonts w:ascii="Consolas" w:hAnsi="Consolas" w:eastAsia="宋体"/>
-          <w:sz w:val="16"/>
-        </w:rPr>
-        <w:t xml:space="preserve"> 制流         为跳转。利用 truelist 进行拉链管理。                  ('J', '_', '_', 9)预期</w:t>
-      </w:r>
-    </w:p>
-    <w:p>
-      <w:pPr>
-        <w:spacing w:after="40" w:line="80" w:lineRule="exact"/>
-      </w:pPr>
-    </w:p>
-    <w:p>
-      <w:pPr>
-        <w:spacing w:after="20" w:line="240" w:lineRule="exact"/>
-      </w:pPr>
-      <w:r>
-        <w:rPr>
-          <w:rFonts w:ascii="Consolas" w:hAnsi="Consolas" w:eastAsia="宋体"/>
-          <w:sz w:val="16"/>
-        </w:rPr>
-        <w:t xml:space="preserve"> 嵌套循    分析多重循环下的 break/continue 逻辑。采用循环           ('J', '_', '_', loop_start)符合</w:t>
-      </w:r>
-    </w:p>
-    <w:p>
-      <w:pPr>
-        <w:spacing w:after="20" w:line="240" w:lineRule="exact"/>
-      </w:pPr>
-      <w:r>
-        <w:rPr>
-          <w:rFonts w:ascii="Consolas" w:hAnsi="Consolas" w:eastAsia="宋体"/>
-          <w:sz w:val="16"/>
-        </w:rPr>
-        <w:t xml:space="preserve">  环           状态栈管理回填链，支持精准跳出。                    ('J', '_', '_', loop_end)预期</w:t>
-      </w:r>
-    </w:p>
-    <w:p>
-      <w:pPr>
-        <w:spacing w:after="40" w:line="80" w:lineRule="exact"/>
-      </w:pPr>
-    </w:p>
-    <w:p>
-      <w:pPr>
-        <w:spacing w:after="20" w:line="240" w:lineRule="exact"/>
-      </w:pPr>
-      <w:r>
-        <w:rPr>
-          <w:rFonts w:ascii="Consolas" w:hAnsi="Consolas" w:eastAsia="宋体"/>
-          <w:sz w:val="16"/>
-        </w:rPr>
-        <w:t xml:space="preserve"> 函数传     预判到参数压栈顺序对函数执行的影响。统一采用                     ('para', 'g', '_', '_')符合</w:t>
-      </w:r>
-    </w:p>
-    <w:p>
-      <w:pPr>
-        <w:spacing w:after="20" w:line="240" w:lineRule="exact"/>
-      </w:pPr>
-      <w:r>
-        <w:rPr>
-          <w:rFonts w:ascii="Consolas" w:hAnsi="Consolas" w:eastAsia="宋体"/>
-          <w:sz w:val="16"/>
-        </w:rPr>
-        <w:t xml:space="preserve">  参         para arg, _, _ 格式确保调用一致性。             ('call', 'func', '_', 't1')预期</w:t>
-      </w:r>
-    </w:p>
-    <w:p>
-      <w:pPr>
-        <w:spacing w:after="40" w:line="80" w:lineRule="exact"/>
-      </w:pPr>
-    </w:p>
-    <w:p>
-      <w:pPr>
-        <w:spacing w:after="40" w:line="80" w:lineRule="exact"/>
-      </w:pPr>
-    </w:p>
-    <w:p>
-      <w:pPr>
-        <w:spacing w:after="120" w:line="300" w:lineRule="exact" w:before="160"/>
+        <w:spacing w:before="160" w:after="100"/>
       </w:pPr>
       <w:r>
         <w:rPr>
@@ -1331,59 +1620,16 @@
     </w:p>
     <w:p>
       <w:pPr>
-        <w:spacing w:after="40" w:line="80" w:lineRule="exact"/>
-      </w:pPr>
-    </w:p>
-    <w:p>
-      <w:pPr>
-        <w:spacing w:after="60" w:line="300" w:lineRule="exact"/>
+        <w:spacing w:line="300" w:lineRule="exact" w:after="60"/>
         <w:ind w:firstLine="420"/>
       </w:pPr>
       <w:r>
         <w:rPr>
           <w:rFonts w:ascii="宋体" w:hAnsi="宋体" w:eastAsia="宋体"/>
+          <w:b w:val="0"/>
           <w:sz w:val="21"/>
         </w:rPr>
-        <w:t>本次实验的核心收获在于拉链回填技术在非线性代码生成中的灵活应用。通过对布尔表达式</w:t>
-      </w:r>
-    </w:p>
-    <w:p>
-      <w:pPr>
-        <w:spacing w:after="60" w:line="300" w:lineRule="exact"/>
-        <w:ind w:firstLine="420"/>
-      </w:pPr>
-      <w:r>
-        <w:rPr>
-          <w:rFonts w:ascii="宋体" w:hAnsi="宋体" w:eastAsia="宋体"/>
-          <w:sz w:val="21"/>
-        </w:rPr>
-        <w:t>在不同语境（数值语境 vs 控制流语境）下的差异化处理，我深刻认识到 AST 在处理上下文敏感</w:t>
-      </w:r>
-    </w:p>
-    <w:p>
-      <w:pPr>
-        <w:spacing w:after="60" w:line="300" w:lineRule="exact"/>
-        <w:ind w:firstLine="420"/>
-      </w:pPr>
-      <w:r>
-        <w:rPr>
-          <w:rFonts w:ascii="宋体" w:hAnsi="宋体" w:eastAsia="宋体"/>
-          <w:sz w:val="21"/>
-        </w:rPr>
-        <w:t>翻译时的巨大优势。程序最终能够精准生成跳转标号，且四元式各分量的引号、下划线及临时变</w:t>
-      </w:r>
-    </w:p>
-    <w:p>
-      <w:pPr>
-        <w:spacing w:after="60" w:line="300" w:lineRule="exact"/>
-        <w:ind w:firstLine="420"/>
-      </w:pPr>
-      <w:r>
-        <w:rPr>
-          <w:rFonts w:ascii="宋体" w:hAnsi="宋体" w:eastAsia="宋体"/>
-          <w:sz w:val="21"/>
-        </w:rPr>
-        <w:t>量编号均符合标准规范，为编译器后端的优化打下了坚实基础。</w:t>
+        <w:t>本次实验的核心收获在于拉链回填技术在非线性代码生成中的灵活应用。通过对布尔表达式在不同语境（数值语境 vs 控制流语境）下的差异化处理，我深刻认识到 AST 在处理上下文敏感翻译时的巨大优势。程序最终能够精准生成跳转标号，且四元式各分量的引号、下划线及临时变量编号均符合标准规范，为编译器后端的优化打下了坚实基础。</w:t>
       </w:r>
     </w:p>
     <w:sectPr>
@@ -1407,6 +1653,7 @@
     <w:r>
       <w:rPr>
         <w:rFonts w:ascii="宋体" w:hAnsi="宋体" w:eastAsia="宋体"/>
+        <w:b w:val="0"/>
         <w:sz w:val="18"/>
       </w:rPr>
       <w:fldChar w:fldCharType="begin"/>

</xml_diff>

<commit_message>
vault backup: 2026-05-08 18:11:44
</commit_message>
<xml_diff>
--- a/学校事务/编译原理/文档编写/编译原理实验报告_语义与中间代码生成.docx
+++ b/学校事务/编译原理/文档编写/编译原理实验报告_语义与中间代码生成.docx
@@ -9,9 +9,9 @@
       </w:pPr>
       <w:r>
         <w:rPr>
-          <w:rFonts w:ascii="黑体" w:hAnsi="黑体" w:eastAsia="黑体"/>
+          <w:rFonts w:ascii="宋体" w:hAnsi="宋体" w:eastAsia="宋体"/>
           <w:b/>
-          <w:sz w:val="48"/>
+          <w:sz w:val="28"/>
         </w:rPr>
         <w:t>《编译原理》实验报告</w:t>
       </w:r>
@@ -24,8 +24,8 @@
       <w:r>
         <w:rPr>
           <w:rFonts w:ascii="宋体" w:hAnsi="宋体" w:eastAsia="宋体"/>
-          <w:b w:val="0"/>
-          <w:sz w:val="32"/>
+          <w:b/>
+          <w:sz w:val="28"/>
         </w:rPr>
         <w:t>语义分析与中间代码生成</w:t>
       </w:r>
@@ -56,10 +56,10 @@
       </w:pPr>
       <w:r>
         <w:rPr>
-          <w:rFonts w:ascii="黑体" w:hAnsi="黑体" w:eastAsia="黑体"/>
+          <w:rFonts w:ascii="宋体" w:hAnsi="宋体" w:eastAsia="宋体"/>
           <w:b/>
           <w:color w:val="1F4E79"/>
-          <w:sz w:val="40"/>
+          <w:sz w:val="28"/>
         </w:rPr>
         <w:t>第一部分：语义</w:t>
       </w:r>
@@ -71,9 +71,9 @@
       </w:pPr>
       <w:r>
         <w:rPr>
-          <w:rFonts w:ascii="黑体" w:hAnsi="黑体" w:eastAsia="黑体"/>
+          <w:rFonts w:ascii="宋体" w:hAnsi="宋体" w:eastAsia="宋体"/>
           <w:b/>
-          <w:sz w:val="32"/>
+          <w:sz w:val="28"/>
         </w:rPr>
         <w:t>《编译原理》实验报告（语义分析）</w:t>
       </w:r>
@@ -98,9 +98,9 @@
       </w:pPr>
       <w:r>
         <w:rPr>
-          <w:rFonts w:ascii="黑体" w:hAnsi="黑体" w:eastAsia="黑体"/>
+          <w:rFonts w:ascii="宋体" w:hAnsi="宋体" w:eastAsia="宋体"/>
           <w:b/>
-          <w:sz w:val="25"/>
+          <w:sz w:val="28"/>
         </w:rPr>
         <w:t>1 实验目的</w:t>
       </w:r>
@@ -125,9 +125,9 @@
       </w:pPr>
       <w:r>
         <w:rPr>
-          <w:rFonts w:ascii="黑体" w:hAnsi="黑体" w:eastAsia="黑体"/>
+          <w:rFonts w:ascii="宋体" w:hAnsi="宋体" w:eastAsia="宋体"/>
           <w:b/>
-          <w:sz w:val="25"/>
+          <w:sz w:val="28"/>
         </w:rPr>
         <w:t>2 实验内容</w:t>
       </w:r>
@@ -152,9 +152,9 @@
       </w:pPr>
       <w:r>
         <w:rPr>
-          <w:rFonts w:ascii="黑体" w:hAnsi="黑体" w:eastAsia="黑体"/>
+          <w:rFonts w:ascii="宋体" w:hAnsi="宋体" w:eastAsia="宋体"/>
           <w:b/>
-          <w:sz w:val="25"/>
+          <w:sz w:val="28"/>
         </w:rPr>
         <w:t>3 实验方案</w:t>
       </w:r>
@@ -165,9 +165,9 @@
       </w:pPr>
       <w:r>
         <w:rPr>
-          <w:rFonts w:ascii="黑体" w:hAnsi="黑体" w:eastAsia="黑体"/>
+          <w:rFonts w:ascii="宋体" w:hAnsi="宋体" w:eastAsia="宋体"/>
           <w:b/>
-          <w:sz w:val="22"/>
+          <w:sz w:val="28"/>
         </w:rPr>
         <w:t>3.1 方案描述</w:t>
       </w:r>
@@ -192,9 +192,9 @@
       </w:pPr>
       <w:r>
         <w:rPr>
-          <w:rFonts w:ascii="黑体" w:hAnsi="黑体" w:eastAsia="黑体"/>
+          <w:rFonts w:ascii="宋体" w:hAnsi="宋体" w:eastAsia="宋体"/>
           <w:b/>
-          <w:sz w:val="22"/>
+          <w:sz w:val="28"/>
         </w:rPr>
         <w:t>3.2 方案分析</w:t>
       </w:r>
@@ -219,9 +219,9 @@
       </w:pPr>
       <w:r>
         <w:rPr>
-          <w:rFonts w:ascii="黑体" w:hAnsi="黑体" w:eastAsia="黑体"/>
+          <w:rFonts w:ascii="宋体" w:hAnsi="宋体" w:eastAsia="宋体"/>
           <w:b/>
-          <w:sz w:val="25"/>
+          <w:sz w:val="28"/>
         </w:rPr>
         <w:t>4 实验测试说明</w:t>
       </w:r>
@@ -270,7 +270,7 @@
               <w:rPr>
                 <w:rFonts w:ascii="宋体" w:hAnsi="宋体" w:eastAsia="宋体"/>
                 <w:b/>
-                <w:sz w:val="18"/>
+                <w:sz w:val="21"/>
               </w:rPr>
               <w:t>测试场景</w:t>
             </w:r>
@@ -292,7 +292,7 @@
               <w:rPr>
                 <w:rFonts w:ascii="宋体" w:hAnsi="宋体" w:eastAsia="宋体"/>
                 <w:b/>
-                <w:sz w:val="18"/>
+                <w:sz w:val="21"/>
               </w:rPr>
               <w:t>逻辑推演与设计考量</w:t>
             </w:r>
@@ -314,7 +314,7 @@
               <w:rPr>
                 <w:rFonts w:ascii="宋体" w:hAnsi="宋体" w:eastAsia="宋体"/>
                 <w:b/>
-                <w:sz w:val="18"/>
+                <w:sz w:val="21"/>
               </w:rPr>
               <w:t>验证结果</w:t>
             </w:r>
@@ -337,7 +337,7 @@
               <w:rPr>
                 <w:rFonts w:ascii="宋体" w:hAnsi="宋体" w:eastAsia="宋体"/>
                 <w:b w:val="0"/>
-                <w:sz w:val="17"/>
+                <w:sz w:val="21"/>
               </w:rPr>
               <w:t>作用域覆盖</w:t>
             </w:r>
@@ -358,7 +358,7 @@
               <w:rPr>
                 <w:rFonts w:ascii="宋体" w:hAnsi="宋体" w:eastAsia="宋体"/>
                 <w:b w:val="0"/>
-                <w:sz w:val="17"/>
+                <w:sz w:val="21"/>
               </w:rPr>
               <w:t>模拟多层嵌套定义。推论要求内层引用屏蔽外层定义，且同级检测冲突。</w:t>
             </w:r>
@@ -379,7 +379,7 @@
               <w:rPr>
                 <w:rFonts w:ascii="宋体" w:hAnsi="宋体" w:eastAsia="宋体"/>
                 <w:b w:val="0"/>
-                <w:sz w:val="17"/>
+                <w:sz w:val="21"/>
               </w:rPr>
               <w:t>逻辑契合。精准识别 301 与 302 异常。</w:t>
             </w:r>
@@ -402,7 +402,7 @@
               <w:rPr>
                 <w:rFonts w:ascii="宋体" w:hAnsi="宋体" w:eastAsia="宋体"/>
                 <w:b w:val="0"/>
-                <w:sz w:val="17"/>
+                <w:sz w:val="21"/>
               </w:rPr>
               <w:t>跳转指令合法性</w:t>
             </w:r>
@@ -423,7 +423,7 @@
               <w:rPr>
                 <w:rFonts w:ascii="宋体" w:hAnsi="宋体" w:eastAsia="宋体"/>
                 <w:b w:val="0"/>
-                <w:sz w:val="17"/>
+                <w:sz w:val="21"/>
               </w:rPr>
               <w:t>考虑到 break 可能隐藏在深层 IfStmt 中。通过上下文路径传递，推测系统需具备全局穿透识别力。</w:t>
             </w:r>
@@ -444,7 +444,7 @@
               <w:rPr>
                 <w:rFonts w:ascii="宋体" w:hAnsi="宋体" w:eastAsia="宋体"/>
                 <w:b w:val="0"/>
-                <w:sz w:val="17"/>
+                <w:sz w:val="21"/>
               </w:rPr>
               <w:t>逻辑契合。成功识别各类跳转作用域，无误报。</w:t>
             </w:r>
@@ -467,7 +467,7 @@
               <w:rPr>
                 <w:rFonts w:ascii="宋体" w:hAnsi="宋体" w:eastAsia="宋体"/>
                 <w:b w:val="0"/>
-                <w:sz w:val="17"/>
+                <w:sz w:val="21"/>
               </w:rPr>
               <w:t>延迟判定定位</w:t>
             </w:r>
@@ -488,7 +488,7 @@
               <w:rPr>
                 <w:rFonts w:ascii="宋体" w:hAnsi="宋体" w:eastAsia="宋体"/>
                 <w:b w:val="0"/>
-                <w:sz w:val="17"/>
+                <w:sz w:val="21"/>
               </w:rPr>
               <w:t>针对 Return 缺失，推测报错需在逻辑终点。设计了行号回溯推演。</w:t>
             </w:r>
@@ -509,7 +509,7 @@
               <w:rPr>
                 <w:rFonts w:ascii="宋体" w:hAnsi="宋体" w:eastAsia="宋体"/>
                 <w:b w:val="0"/>
-                <w:sz w:val="17"/>
+                <w:sz w:val="21"/>
               </w:rPr>
               <w:t>逻辑契合。在函数终点准确报告 307。</w:t>
             </w:r>
@@ -528,9 +528,9 @@
       </w:pPr>
       <w:r>
         <w:rPr>
-          <w:rFonts w:ascii="黑体" w:hAnsi="黑体" w:eastAsia="黑体"/>
+          <w:rFonts w:ascii="宋体" w:hAnsi="宋体" w:eastAsia="宋体"/>
           <w:b/>
-          <w:sz w:val="25"/>
+          <w:sz w:val="28"/>
         </w:rPr>
         <w:t>5 实验结论及分析</w:t>
       </w:r>
@@ -561,10 +561,10 @@
       </w:pPr>
       <w:r>
         <w:rPr>
-          <w:rFonts w:ascii="黑体" w:hAnsi="黑体" w:eastAsia="黑体"/>
+          <w:rFonts w:ascii="宋体" w:hAnsi="宋体" w:eastAsia="宋体"/>
           <w:b/>
           <w:color w:val="1F4E79"/>
-          <w:sz w:val="40"/>
+          <w:sz w:val="28"/>
         </w:rPr>
         <w:t>第二部分：中间代码生成</w:t>
       </w:r>
@@ -576,9 +576,9 @@
       </w:pPr>
       <w:r>
         <w:rPr>
-          <w:rFonts w:ascii="黑体" w:hAnsi="黑体" w:eastAsia="黑体"/>
+          <w:rFonts w:ascii="宋体" w:hAnsi="宋体" w:eastAsia="宋体"/>
           <w:b/>
-          <w:sz w:val="32"/>
+          <w:sz w:val="28"/>
         </w:rPr>
         <w:t>《编译原理》实验报告（中间代码生成）</w:t>
       </w:r>
@@ -603,9 +603,9 @@
       </w:pPr>
       <w:r>
         <w:rPr>
-          <w:rFonts w:ascii="黑体" w:hAnsi="黑体" w:eastAsia="黑体"/>
+          <w:rFonts w:ascii="宋体" w:hAnsi="宋体" w:eastAsia="宋体"/>
           <w:b/>
-          <w:sz w:val="25"/>
+          <w:sz w:val="28"/>
         </w:rPr>
         <w:t>1 实验目的</w:t>
       </w:r>
@@ -630,9 +630,9 @@
       </w:pPr>
       <w:r>
         <w:rPr>
-          <w:rFonts w:ascii="黑体" w:hAnsi="黑体" w:eastAsia="黑体"/>
+          <w:rFonts w:ascii="宋体" w:hAnsi="宋体" w:eastAsia="宋体"/>
           <w:b/>
-          <w:sz w:val="25"/>
+          <w:sz w:val="28"/>
         </w:rPr>
         <w:t>2 实验内容</w:t>
       </w:r>
@@ -657,9 +657,9 @@
       </w:pPr>
       <w:r>
         <w:rPr>
-          <w:rFonts w:ascii="黑体" w:hAnsi="黑体" w:eastAsia="黑体"/>
+          <w:rFonts w:ascii="宋体" w:hAnsi="宋体" w:eastAsia="宋体"/>
           <w:b/>
-          <w:sz w:val="25"/>
+          <w:sz w:val="28"/>
         </w:rPr>
         <w:t>3 实验方案</w:t>
       </w:r>
@@ -670,9 +670,9 @@
       </w:pPr>
       <w:r>
         <w:rPr>
-          <w:rFonts w:ascii="黑体" w:hAnsi="黑体" w:eastAsia="黑体"/>
+          <w:rFonts w:ascii="宋体" w:hAnsi="宋体" w:eastAsia="宋体"/>
           <w:b/>
-          <w:sz w:val="22"/>
+          <w:sz w:val="28"/>
         </w:rPr>
         <w:t>3.1 方案描述（双遍 AST 遍历与拉链回填）</w:t>
       </w:r>
@@ -739,9 +739,9 @@
       </w:pPr>
       <w:r>
         <w:rPr>
-          <w:rFonts w:ascii="黑体" w:hAnsi="黑体" w:eastAsia="黑体"/>
+          <w:rFonts w:ascii="宋体" w:hAnsi="宋体" w:eastAsia="宋体"/>
           <w:b/>
-          <w:sz w:val="22"/>
+          <w:sz w:val="28"/>
         </w:rPr>
         <w:t>3.2 方案对比分析</w:t>
       </w:r>
@@ -776,7 +776,7 @@
               <w:rPr>
                 <w:rFonts w:ascii="宋体" w:hAnsi="宋体" w:eastAsia="宋体"/>
                 <w:b/>
-                <w:sz w:val="18"/>
+                <w:sz w:val="21"/>
               </w:rPr>
               <w:t>维度</w:t>
             </w:r>
@@ -798,7 +798,7 @@
               <w:rPr>
                 <w:rFonts w:ascii="宋体" w:hAnsi="宋体" w:eastAsia="宋体"/>
                 <w:b/>
-                <w:sz w:val="18"/>
+                <w:sz w:val="21"/>
               </w:rPr>
               <w:t>单遍 SDT 方案</w:t>
             </w:r>
@@ -820,7 +820,7 @@
               <w:rPr>
                 <w:rFonts w:ascii="宋体" w:hAnsi="宋体" w:eastAsia="宋体"/>
                 <w:b/>
-                <w:sz w:val="18"/>
+                <w:sz w:val="21"/>
               </w:rPr>
               <w:t>AST 遍历方案（本实验选择）</w:t>
             </w:r>
@@ -843,7 +843,7 @@
               <w:rPr>
                 <w:rFonts w:ascii="宋体" w:hAnsi="宋体" w:eastAsia="宋体"/>
                 <w:b w:val="0"/>
-                <w:sz w:val="17"/>
+                <w:sz w:val="21"/>
               </w:rPr>
               <w:t>逻辑耦合度</w:t>
             </w:r>
@@ -864,7 +864,7 @@
               <w:rPr>
                 <w:rFonts w:ascii="宋体" w:hAnsi="宋体" w:eastAsia="宋体"/>
                 <w:b w:val="0"/>
-                <w:sz w:val="17"/>
+                <w:sz w:val="21"/>
               </w:rPr>
               <w:t>语法分析与代码生成高度耦合，不便调试。</w:t>
             </w:r>
@@ -885,7 +885,7 @@
               <w:rPr>
                 <w:rFonts w:ascii="宋体" w:hAnsi="宋体" w:eastAsia="宋体"/>
                 <w:b w:val="0"/>
-                <w:sz w:val="17"/>
+                <w:sz w:val="21"/>
               </w:rPr>
               <w:t>模块化程度高，语法树构建与代码生成完全解耦。</w:t>
             </w:r>
@@ -908,7 +908,7 @@
               <w:rPr>
                 <w:rFonts w:ascii="宋体" w:hAnsi="宋体" w:eastAsia="宋体"/>
                 <w:b w:val="0"/>
-                <w:sz w:val="17"/>
+                <w:sz w:val="21"/>
               </w:rPr>
               <w:t>短路求值处理</w:t>
             </w:r>
@@ -929,7 +929,7 @@
               <w:rPr>
                 <w:rFonts w:ascii="宋体" w:hAnsi="宋体" w:eastAsia="宋体"/>
                 <w:b w:val="0"/>
-                <w:sz w:val="17"/>
+                <w:sz w:val="21"/>
               </w:rPr>
               <w:t>在解析过程中处理回填链条极其复杂。</w:t>
             </w:r>
@@ -950,7 +950,7 @@
               <w:rPr>
                 <w:rFonts w:ascii="宋体" w:hAnsi="宋体" w:eastAsia="宋体"/>
                 <w:b w:val="0"/>
-                <w:sz w:val="17"/>
+                <w:sz w:val="21"/>
               </w:rPr>
               <w:t>处理自然，可根据父节点类型决定子树的翻译模式。</w:t>
             </w:r>
@@ -973,7 +973,7 @@
               <w:rPr>
                 <w:rFonts w:ascii="宋体" w:hAnsi="宋体" w:eastAsia="宋体"/>
                 <w:b w:val="0"/>
-                <w:sz w:val="17"/>
+                <w:sz w:val="21"/>
               </w:rPr>
               <w:t>右结合赋值</w:t>
             </w:r>
@@ -994,7 +994,7 @@
               <w:rPr>
                 <w:rFonts w:ascii="宋体" w:hAnsi="宋体" w:eastAsia="宋体"/>
                 <w:b w:val="0"/>
-                <w:sz w:val="17"/>
+                <w:sz w:val="21"/>
               </w:rPr>
               <w:t>难以直接处理 a = b = 0 等连续赋值。</w:t>
             </w:r>
@@ -1015,7 +1015,7 @@
               <w:rPr>
                 <w:rFonts w:ascii="宋体" w:hAnsi="宋体" w:eastAsia="宋体"/>
                 <w:b w:val="0"/>
-                <w:sz w:val="17"/>
+                <w:sz w:val="21"/>
               </w:rPr>
               <w:t>天然支持，通过树的后序遍历轻松实现右结合逻辑。</w:t>
             </w:r>
@@ -1034,9 +1034,9 @@
       </w:pPr>
       <w:r>
         <w:rPr>
-          <w:rFonts w:ascii="黑体" w:hAnsi="黑体" w:eastAsia="黑体"/>
+          <w:rFonts w:ascii="宋体" w:hAnsi="宋体" w:eastAsia="宋体"/>
           <w:b/>
-          <w:sz w:val="25"/>
+          <w:sz w:val="28"/>
         </w:rPr>
         <w:t>4 实验验证与分析</w:t>
       </w:r>
@@ -1086,7 +1086,7 @@
               <w:rPr>
                 <w:rFonts w:ascii="宋体" w:hAnsi="宋体" w:eastAsia="宋体"/>
                 <w:b/>
-                <w:sz w:val="18"/>
+                <w:sz w:val="21"/>
               </w:rPr>
               <w:t>场景类别</w:t>
             </w:r>
@@ -1108,7 +1108,7 @@
               <w:rPr>
                 <w:rFonts w:ascii="宋体" w:hAnsi="宋体" w:eastAsia="宋体"/>
                 <w:b/>
-                <w:sz w:val="18"/>
+                <w:sz w:val="21"/>
               </w:rPr>
               <w:t>程序逻辑预判与技术对策</w:t>
             </w:r>
@@ -1130,7 +1130,7 @@
               <w:rPr>
                 <w:rFonts w:ascii="宋体" w:hAnsi="宋体" w:eastAsia="宋体"/>
                 <w:b/>
-                <w:sz w:val="18"/>
+                <w:sz w:val="21"/>
               </w:rPr>
               <w:t>翻译核心逻辑（部分四元式示例）</w:t>
             </w:r>
@@ -1152,7 +1152,7 @@
               <w:rPr>
                 <w:rFonts w:ascii="宋体" w:hAnsi="宋体" w:eastAsia="宋体"/>
                 <w:b/>
-                <w:sz w:val="18"/>
+                <w:sz w:val="21"/>
               </w:rPr>
               <w:t>验证结果</w:t>
             </w:r>
@@ -1175,7 +1175,7 @@
               <w:rPr>
                 <w:rFonts w:ascii="宋体" w:hAnsi="宋体" w:eastAsia="宋体"/>
                 <w:b w:val="0"/>
-                <w:sz w:val="17"/>
+                <w:sz w:val="21"/>
               </w:rPr>
               <w:t>复杂算术</w:t>
             </w:r>
@@ -1196,7 +1196,7 @@
               <w:rPr>
                 <w:rFonts w:ascii="宋体" w:hAnsi="宋体" w:eastAsia="宋体"/>
                 <w:b w:val="0"/>
-                <w:sz w:val="17"/>
+                <w:sz w:val="21"/>
               </w:rPr>
               <w:t>考虑到长表达式中运算符优先级和括号的深度嵌套。采用后序遍历，确保临时变量自增顺序。</w:t>
             </w:r>
@@ -1217,7 +1217,7 @@
               <w:rPr>
                 <w:rFonts w:ascii="宋体" w:hAnsi="宋体" w:eastAsia="宋体"/>
                 <w:b w:val="0"/>
-                <w:sz w:val="17"/>
+                <w:sz w:val="21"/>
               </w:rPr>
               <w:t>('+', 'a', 'b', 't1')</w:t>
               <w:br/>
@@ -1240,7 +1240,7 @@
               <w:rPr>
                 <w:rFonts w:ascii="宋体" w:hAnsi="宋体" w:eastAsia="宋体"/>
                 <w:b w:val="0"/>
-                <w:sz w:val="17"/>
+                <w:sz w:val="21"/>
               </w:rPr>
               <w:t>符合预期</w:t>
             </w:r>
@@ -1263,7 +1263,7 @@
               <w:rPr>
                 <w:rFonts w:ascii="宋体" w:hAnsi="宋体" w:eastAsia="宋体"/>
                 <w:b w:val="0"/>
-                <w:sz w:val="17"/>
+                <w:sz w:val="21"/>
               </w:rPr>
               <w:t>逻辑计算</w:t>
             </w:r>
@@ -1284,7 +1284,7 @@
               <w:rPr>
                 <w:rFonts w:ascii="宋体" w:hAnsi="宋体" w:eastAsia="宋体"/>
                 <w:b w:val="0"/>
-                <w:sz w:val="17"/>
+                <w:sz w:val="21"/>
               </w:rPr>
               <w:t>分析得出赋值语句中的布尔运算不应产生跳转，而是作为普通计算。引入布尔值求值节点。</w:t>
             </w:r>
@@ -1305,7 +1305,7 @@
               <w:rPr>
                 <w:rFonts w:ascii="宋体" w:hAnsi="宋体" w:eastAsia="宋体"/>
                 <w:b w:val="0"/>
-                <w:sz w:val="17"/>
+                <w:sz w:val="21"/>
               </w:rPr>
               <w:t>('&amp;&amp;', 't2', 't3', 't4')</w:t>
               <w:br/>
@@ -1328,7 +1328,7 @@
               <w:rPr>
                 <w:rFonts w:ascii="宋体" w:hAnsi="宋体" w:eastAsia="宋体"/>
                 <w:b w:val="0"/>
-                <w:sz w:val="17"/>
+                <w:sz w:val="21"/>
               </w:rPr>
               <w:t>符合预期</w:t>
             </w:r>
@@ -1351,7 +1351,7 @@
               <w:rPr>
                 <w:rFonts w:ascii="宋体" w:hAnsi="宋体" w:eastAsia="宋体"/>
                 <w:b w:val="0"/>
-                <w:sz w:val="17"/>
+                <w:sz w:val="21"/>
               </w:rPr>
               <w:t>短路控制流</w:t>
             </w:r>
@@ -1372,7 +1372,7 @@
               <w:rPr>
                 <w:rFonts w:ascii="宋体" w:hAnsi="宋体" w:eastAsia="宋体"/>
                 <w:b w:val="0"/>
-                <w:sz w:val="17"/>
+                <w:sz w:val="21"/>
               </w:rPr>
               <w:t>关键难点：预判到 if/while 条件中的逻辑运算符需翻译为跳转。利用 truelist 进行拉链管理。</w:t>
             </w:r>
@@ -1393,7 +1393,7 @@
               <w:rPr>
                 <w:rFonts w:ascii="宋体" w:hAnsi="宋体" w:eastAsia="宋体"/>
                 <w:b w:val="0"/>
-                <w:sz w:val="17"/>
+                <w:sz w:val="21"/>
               </w:rPr>
               <w:t>('J&gt;', 'x', '0', 5)</w:t>
               <w:br/>
@@ -1416,7 +1416,7 @@
               <w:rPr>
                 <w:rFonts w:ascii="宋体" w:hAnsi="宋体" w:eastAsia="宋体"/>
                 <w:b w:val="0"/>
-                <w:sz w:val="17"/>
+                <w:sz w:val="21"/>
               </w:rPr>
               <w:t>符合预期</w:t>
             </w:r>
@@ -1439,7 +1439,7 @@
               <w:rPr>
                 <w:rFonts w:ascii="宋体" w:hAnsi="宋体" w:eastAsia="宋体"/>
                 <w:b w:val="0"/>
-                <w:sz w:val="17"/>
+                <w:sz w:val="21"/>
               </w:rPr>
               <w:t>嵌套循环</w:t>
             </w:r>
@@ -1460,7 +1460,7 @@
               <w:rPr>
                 <w:rFonts w:ascii="宋体" w:hAnsi="宋体" w:eastAsia="宋体"/>
                 <w:b w:val="0"/>
-                <w:sz w:val="17"/>
+                <w:sz w:val="21"/>
               </w:rPr>
               <w:t>分析多重循环下的 break/continue 逻辑。采用循环状态栈管理回填链，支持精准跳出。</w:t>
             </w:r>
@@ -1481,7 +1481,7 @@
               <w:rPr>
                 <w:rFonts w:ascii="宋体" w:hAnsi="宋体" w:eastAsia="宋体"/>
                 <w:b w:val="0"/>
-                <w:sz w:val="17"/>
+                <w:sz w:val="21"/>
               </w:rPr>
               <w:t>('J', '_', '_', loop_start)</w:t>
               <w:br/>
@@ -1504,7 +1504,7 @@
               <w:rPr>
                 <w:rFonts w:ascii="宋体" w:hAnsi="宋体" w:eastAsia="宋体"/>
                 <w:b w:val="0"/>
-                <w:sz w:val="17"/>
+                <w:sz w:val="21"/>
               </w:rPr>
               <w:t>符合预期</w:t>
             </w:r>
@@ -1527,7 +1527,7 @@
               <w:rPr>
                 <w:rFonts w:ascii="宋体" w:hAnsi="宋体" w:eastAsia="宋体"/>
                 <w:b w:val="0"/>
-                <w:sz w:val="17"/>
+                <w:sz w:val="21"/>
               </w:rPr>
               <w:t>函数传参</w:t>
             </w:r>
@@ -1548,7 +1548,7 @@
               <w:rPr>
                 <w:rFonts w:ascii="宋体" w:hAnsi="宋体" w:eastAsia="宋体"/>
                 <w:b w:val="0"/>
-                <w:sz w:val="17"/>
+                <w:sz w:val="21"/>
               </w:rPr>
               <w:t>预判到参数压栈顺序对函数执行的影响。统一采用 para arg, _, _ 格式确保调用一致性。</w:t>
             </w:r>
@@ -1569,7 +1569,7 @@
               <w:rPr>
                 <w:rFonts w:ascii="宋体" w:hAnsi="宋体" w:eastAsia="宋体"/>
                 <w:b w:val="0"/>
-                <w:sz w:val="17"/>
+                <w:sz w:val="21"/>
               </w:rPr>
               <w:t>('para', 'g', '_', '_')</w:t>
               <w:br/>
@@ -1592,7 +1592,7 @@
               <w:rPr>
                 <w:rFonts w:ascii="宋体" w:hAnsi="宋体" w:eastAsia="宋体"/>
                 <w:b w:val="0"/>
-                <w:sz w:val="17"/>
+                <w:sz w:val="21"/>
               </w:rPr>
               <w:t>符合预期</w:t>
             </w:r>
@@ -1611,9 +1611,9 @@
       </w:pPr>
       <w:r>
         <w:rPr>
-          <w:rFonts w:ascii="黑体" w:hAnsi="黑体" w:eastAsia="黑体"/>
+          <w:rFonts w:ascii="宋体" w:hAnsi="宋体" w:eastAsia="宋体"/>
           <w:b/>
-          <w:sz w:val="25"/>
+          <w:sz w:val="28"/>
         </w:rPr>
         <w:t>5 实验结论</w:t>
       </w:r>

</xml_diff>